<commit_message>
continued update for LTspice
</commit_message>
<xml_diff>
--- a/Labs/lab10 curveTracer 555timer/curveTracer 555timer Document.docx
+++ b/Labs/lab10 curveTracer 555timer/curveTracer 555timer Document.docx
@@ -1051,6 +1051,9 @@
         <w:spacing w:before="100" w:beforeAutospacing="1" w:after="100" w:afterAutospacing="1" w:line="240" w:lineRule="auto"/>
       </w:pPr>
       <w:r>
+        <w:rPr>
+          <w:noProof/>
+        </w:rPr>
         <w:drawing>
           <wp:inline distT="0" distB="0" distL="0" distR="0" wp14:anchorId="5AAB5ED8" wp14:editId="22A25228">
             <wp:extent cx="2737353" cy="2286000"/>
@@ -1100,27 +1103,14 @@
       <w:r>
         <w:t xml:space="preserve">Figure </w:t>
       </w:r>
-      <w:r>
-        <w:fldChar w:fldCharType="begin"/>
-      </w:r>
-      <w:r>
-        <w:instrText xml:space="preserve"> SEQ Figure \* ARABIC </w:instrText>
-      </w:r>
-      <w:r>
-        <w:fldChar w:fldCharType="separate"/>
-      </w:r>
-      <w:r>
-        <w:rPr>
-          <w:noProof/>
-        </w:rPr>
-        <w:t>1</w:t>
-      </w:r>
-      <w:r>
-        <w:rPr>
-          <w:noProof/>
-        </w:rPr>
-        <w:fldChar w:fldCharType="end"/>
-      </w:r>
+      <w:fldSimple w:instr=" SEQ Figure \* ARABIC ">
+        <w:r>
+          <w:rPr>
+            <w:noProof/>
+          </w:rPr>
+          <w:t>1</w:t>
+        </w:r>
+      </w:fldSimple>
       <w:bookmarkEnd w:id="1"/>
       <w:r>
         <w:t xml:space="preserve">: The output of the </w:t>
@@ -1132,7 +1122,15 @@
         <w:t>oscillates with a predictable period and duty cycle.</w:t>
       </w:r>
       <w:r>
-        <w:t xml:space="preserve">  Schematic drawn in LTspice.</w:t>
+        <w:t xml:space="preserve">  Schematic drawn in </w:t>
+      </w:r>
+      <w:proofErr w:type="spellStart"/>
+      <w:r>
+        <w:t>LTspice</w:t>
+      </w:r>
+      <w:proofErr w:type="spellEnd"/>
+      <w:r>
+        <w:t>.</w:t>
       </w:r>
     </w:p>
     <w:p>
@@ -1142,8 +1140,13 @@
           <w:iCs/>
         </w:rPr>
       </w:pPr>
-      <w:r>
-        <w:t>In order to analyze the circuit in</w:t>
+      <w:proofErr w:type="gramStart"/>
+      <w:r>
+        <w:t>In order to</w:t>
+      </w:r>
+      <w:proofErr w:type="gramEnd"/>
+      <w:r>
+        <w:t xml:space="preserve"> analyze the circuit in</w:t>
       </w:r>
       <w:r>
         <w:rPr>
@@ -1526,36 +1529,31 @@
       <w:r>
         <w:t xml:space="preserve">Figure </w:t>
       </w:r>
-      <w:r>
-        <w:fldChar w:fldCharType="begin"/>
-      </w:r>
-      <w:r>
-        <w:instrText xml:space="preserve"> SEQ Figure \* ARABIC </w:instrText>
-      </w:r>
-      <w:r>
-        <w:fldChar w:fldCharType="separate"/>
-      </w:r>
-      <w:r>
-        <w:rPr>
-          <w:noProof/>
-        </w:rPr>
-        <w:t>2</w:t>
-      </w:r>
-      <w:r>
-        <w:rPr>
-          <w:noProof/>
-        </w:rPr>
-        <w:fldChar w:fldCharType="end"/>
-      </w:r>
+      <w:fldSimple w:instr=" SEQ Figure \* ARABIC ">
+        <w:r>
+          <w:rPr>
+            <w:noProof/>
+          </w:rPr>
+          <w:t>2</w:t>
+        </w:r>
+      </w:fldSimple>
       <w:bookmarkEnd w:id="2"/>
       <w:r>
-        <w:t>: A highly simplified rendering of a 555</w:t>
+        <w:t xml:space="preserve">: A highly simplified rendering of </w:t>
+      </w:r>
+      <w:proofErr w:type="gramStart"/>
+      <w:r>
+        <w:t>a 555</w:t>
       </w:r>
       <w:r>
         <w:t xml:space="preserve"> Timer’s</w:t>
       </w:r>
       <w:r>
-        <w:t xml:space="preserve"> internals.</w:t>
+        <w:t xml:space="preserve"> internals</w:t>
+      </w:r>
+      <w:proofErr w:type="gramEnd"/>
+      <w:r>
+        <w:t>.</w:t>
       </w:r>
     </w:p>
     <w:p>
@@ -2234,27 +2232,14 @@
       <w:r>
         <w:t xml:space="preserve">Table </w:t>
       </w:r>
-      <w:r>
-        <w:fldChar w:fldCharType="begin"/>
-      </w:r>
-      <w:r>
-        <w:instrText xml:space="preserve"> SEQ Table \* ARABIC </w:instrText>
-      </w:r>
-      <w:r>
-        <w:fldChar w:fldCharType="separate"/>
-      </w:r>
-      <w:r>
-        <w:rPr>
-          <w:noProof/>
-        </w:rPr>
-        <w:t>1</w:t>
-      </w:r>
-      <w:r>
-        <w:rPr>
-          <w:noProof/>
-        </w:rPr>
-        <w:fldChar w:fldCharType="end"/>
-      </w:r>
+      <w:fldSimple w:instr=" SEQ Table \* ARABIC ">
+        <w:r>
+          <w:rPr>
+            <w:noProof/>
+          </w:rPr>
+          <w:t>1</w:t>
+        </w:r>
+      </w:fldSimple>
       <w:r>
         <w:t>: State table for an SR-latch</w:t>
       </w:r>
@@ -3059,7 +3044,21 @@
         <w:rPr>
           <w:iCs/>
         </w:rPr>
-        <w:t xml:space="preserve">signal, hence the arrow head.  When </w:t>
+        <w:t xml:space="preserve">signal, hence the </w:t>
+      </w:r>
+      <w:proofErr w:type="gramStart"/>
+      <w:r>
+        <w:rPr>
+          <w:iCs/>
+        </w:rPr>
+        <w:t>arrow head</w:t>
+      </w:r>
+      <w:proofErr w:type="gramEnd"/>
+      <w:r>
+        <w:rPr>
+          <w:iCs/>
+        </w:rPr>
+        <w:t xml:space="preserve">.  When </w:t>
       </w:r>
       <m:oMath>
         <m:acc>
@@ -3093,7 +3092,21 @@
         <w:rPr>
           <w:iCs/>
         </w:rPr>
-        <w:t xml:space="preserve"> the switch is closed, connecting the DIS pin to ground.  When </w:t>
+        <w:t xml:space="preserve"> the switch is closed, </w:t>
+      </w:r>
+      <w:proofErr w:type="gramStart"/>
+      <w:r>
+        <w:rPr>
+          <w:iCs/>
+        </w:rPr>
+        <w:t>connecting</w:t>
+      </w:r>
+      <w:proofErr w:type="gramEnd"/>
+      <w:r>
+        <w:rPr>
+          <w:iCs/>
+        </w:rPr>
+        <w:t xml:space="preserve"> the DIS pin to ground.  When </w:t>
       </w:r>
       <m:oMath>
         <m:acc>
@@ -3135,7 +3148,14 @@
         <w:rPr>
           <w:iCs/>
         </w:rPr>
-        <w:t xml:space="preserve">  In reality</w:t>
+        <w:t xml:space="preserve">  </w:t>
+      </w:r>
+      <w:proofErr w:type="gramStart"/>
+      <w:r>
+        <w:rPr>
+          <w:iCs/>
+        </w:rPr>
+        <w:t>In reality</w:t>
       </w:r>
       <w:r>
         <w:rPr>
@@ -3147,7 +3167,14 @@
         <w:rPr>
           <w:iCs/>
         </w:rPr>
-        <w:t xml:space="preserve"> this voltage-controlled switch is a</w:t>
+        <w:t xml:space="preserve"> this</w:t>
+      </w:r>
+      <w:proofErr w:type="gramEnd"/>
+      <w:r>
+        <w:rPr>
+          <w:iCs/>
+        </w:rPr>
+        <w:t xml:space="preserve"> voltage-controlled switch is a</w:t>
       </w:r>
       <w:r>
         <w:rPr>
@@ -3177,7 +3204,21 @@
         <w:rPr>
           <w:iCs/>
         </w:rPr>
-        <w:t>replaced it with something more intuitive.</w:t>
+        <w:t xml:space="preserve">replaced </w:t>
+      </w:r>
+      <w:proofErr w:type="gramStart"/>
+      <w:r>
+        <w:rPr>
+          <w:iCs/>
+        </w:rPr>
+        <w:t>it</w:t>
+      </w:r>
+      <w:proofErr w:type="gramEnd"/>
+      <w:r>
+        <w:rPr>
+          <w:iCs/>
+        </w:rPr>
+        <w:t xml:space="preserve"> with something more intuitive.</w:t>
       </w:r>
     </w:p>
     <w:p>
@@ -3745,7 +3786,7 @@
           <w:noProof/>
         </w:rPr>
         <w:drawing>
-          <wp:inline distT="0" distB="0" distL="0" distR="0" wp14:anchorId="391330D9" wp14:editId="702B88C5">
+          <wp:inline distT="0" distB="0" distL="0" distR="0" wp14:anchorId="391330D9" wp14:editId="78BD5760">
             <wp:extent cx="3032702" cy="1553952"/>
             <wp:effectExtent l="0" t="0" r="0" b="8255"/>
             <wp:docPr id="20" name="Picture 20"/>
@@ -3806,27 +3847,14 @@
       <w:r>
         <w:t xml:space="preserve">Figure </w:t>
       </w:r>
-      <w:r>
-        <w:fldChar w:fldCharType="begin"/>
-      </w:r>
-      <w:r>
-        <w:instrText xml:space="preserve"> SEQ Figure \* ARABIC </w:instrText>
-      </w:r>
-      <w:r>
-        <w:fldChar w:fldCharType="separate"/>
-      </w:r>
-      <w:r>
-        <w:rPr>
-          <w:noProof/>
-        </w:rPr>
-        <w:t>3</w:t>
-      </w:r>
-      <w:r>
-        <w:rPr>
-          <w:noProof/>
-        </w:rPr>
-        <w:fldChar w:fldCharType="end"/>
-      </w:r>
+      <w:fldSimple w:instr=" SEQ Figure \* ARABIC ">
+        <w:r>
+          <w:rPr>
+            <w:noProof/>
+          </w:rPr>
+          <w:t>3</w:t>
+        </w:r>
+      </w:fldSimple>
       <w:bookmarkEnd w:id="5"/>
       <w:r>
         <w:t>: Determine the effect of V</w:t>
@@ -4152,27 +4180,14 @@
       <w:r>
         <w:t xml:space="preserve">Figure </w:t>
       </w:r>
-      <w:r>
-        <w:fldChar w:fldCharType="begin"/>
-      </w:r>
-      <w:r>
-        <w:instrText xml:space="preserve"> SEQ Figure \* ARABIC </w:instrText>
-      </w:r>
-      <w:r>
-        <w:fldChar w:fldCharType="separate"/>
-      </w:r>
-      <w:r>
-        <w:rPr>
-          <w:noProof/>
-        </w:rPr>
-        <w:t>4</w:t>
-      </w:r>
-      <w:r>
-        <w:rPr>
-          <w:noProof/>
-        </w:rPr>
-        <w:fldChar w:fldCharType="end"/>
-      </w:r>
+      <w:fldSimple w:instr=" SEQ Figure \* ARABIC ">
+        <w:r>
+          <w:rPr>
+            <w:noProof/>
+          </w:rPr>
+          <w:t>4</w:t>
+        </w:r>
+      </w:fldSimple>
       <w:bookmarkEnd w:id="6"/>
       <w:r>
         <w:t xml:space="preserve">: The circuit in </w:t>
@@ -4330,7 +4345,15 @@
         <w:t xml:space="preserve"> </w:t>
       </w:r>
       <w:r>
-        <w:t xml:space="preserve">to determine to describe what the external circuit in </w:t>
+        <w:t xml:space="preserve">to </w:t>
+      </w:r>
+      <w:proofErr w:type="gramStart"/>
+      <w:r>
+        <w:t>determine to describe</w:t>
+      </w:r>
+      <w:proofErr w:type="gramEnd"/>
+      <w:r>
+        <w:t xml:space="preserve"> what the external circuit in </w:t>
       </w:r>
       <w:r>
         <w:rPr>
@@ -6256,27 +6279,14 @@
       <w:r>
         <w:t xml:space="preserve">Figure </w:t>
       </w:r>
-      <w:r>
-        <w:fldChar w:fldCharType="begin"/>
-      </w:r>
-      <w:r>
-        <w:instrText xml:space="preserve"> SEQ Figure \* ARABIC </w:instrText>
-      </w:r>
-      <w:r>
-        <w:fldChar w:fldCharType="separate"/>
-      </w:r>
-      <w:r>
-        <w:rPr>
-          <w:noProof/>
-        </w:rPr>
-        <w:t>5</w:t>
-      </w:r>
-      <w:r>
-        <w:rPr>
-          <w:noProof/>
-        </w:rPr>
-        <w:fldChar w:fldCharType="end"/>
-      </w:r>
+      <w:fldSimple w:instr=" SEQ Figure \* ARABIC ">
+        <w:r>
+          <w:rPr>
+            <w:noProof/>
+          </w:rPr>
+          <w:t>5</w:t>
+        </w:r>
+      </w:fldSimple>
       <w:bookmarkEnd w:id="9"/>
       <w:r>
         <w:t>: External circuits and internal organization of the</w:t>
@@ -6288,11 +6298,16 @@
         <w:t>555</w:t>
       </w:r>
       <w:r>
-        <w:t xml:space="preserve"> Timer </w:t>
+        <w:t xml:space="preserve"> </w:t>
+      </w:r>
+      <w:proofErr w:type="gramStart"/>
+      <w:r>
+        <w:t xml:space="preserve">Timer </w:t>
       </w:r>
       <w:r>
         <w:t>.</w:t>
       </w:r>
+      <w:proofErr w:type="gramEnd"/>
     </w:p>
     <w:p>
       <w:pPr>
@@ -7575,27 +7590,14 @@
       <w:r>
         <w:t xml:space="preserve">Figure </w:t>
       </w:r>
-      <w:r>
-        <w:fldChar w:fldCharType="begin"/>
-      </w:r>
-      <w:r>
-        <w:instrText xml:space="preserve"> SEQ Figure \* ARABIC </w:instrText>
-      </w:r>
-      <w:r>
-        <w:fldChar w:fldCharType="separate"/>
-      </w:r>
-      <w:r>
-        <w:rPr>
-          <w:noProof/>
-        </w:rPr>
-        <w:t>6</w:t>
-      </w:r>
-      <w:r>
-        <w:rPr>
-          <w:noProof/>
-        </w:rPr>
-        <w:fldChar w:fldCharType="end"/>
-      </w:r>
+      <w:fldSimple w:instr=" SEQ Figure \* ARABIC ">
+        <w:r>
+          <w:rPr>
+            <w:noProof/>
+          </w:rPr>
+          <w:t>6</w:t>
+        </w:r>
+      </w:fldSimple>
       <w:bookmarkEnd w:id="15"/>
       <w:r>
         <w:t xml:space="preserve">: </w:t>
@@ -7664,7 +7666,15 @@
         <w:t xml:space="preserve">. </w:t>
       </w:r>
       <w:r>
-        <w:t xml:space="preserve">  Note the rise time corresponds to the output of the 555</w:t>
+        <w:t xml:space="preserve">  Note the </w:t>
+      </w:r>
+      <w:proofErr w:type="gramStart"/>
+      <w:r>
+        <w:t>rise</w:t>
+      </w:r>
+      <w:proofErr w:type="gramEnd"/>
+      <w:r>
+        <w:t xml:space="preserve"> time corresponds to the output of the 555</w:t>
       </w:r>
       <w:r>
         <w:t xml:space="preserve"> Timer</w:t>
@@ -8170,9 +8180,11 @@
       <w:r>
         <w:t xml:space="preserve"> in </w:t>
       </w:r>
+      <w:proofErr w:type="spellStart"/>
       <w:r>
         <w:t>LTspice</w:t>
       </w:r>
+      <w:proofErr w:type="spellEnd"/>
       <w:r>
         <w:t>.</w:t>
       </w:r>
@@ -8185,6 +8197,9 @@
         <w:jc w:val="right"/>
       </w:pPr>
       <w:r>
+        <w:rPr>
+          <w:noProof/>
+        </w:rPr>
         <w:lastRenderedPageBreak/>
         <w:drawing>
           <wp:inline distT="0" distB="0" distL="0" distR="0" wp14:anchorId="70CB4550" wp14:editId="13283B00">
@@ -8235,27 +8250,14 @@
       <w:r>
         <w:t xml:space="preserve">Figure </w:t>
       </w:r>
-      <w:r>
-        <w:fldChar w:fldCharType="begin"/>
-      </w:r>
-      <w:r>
-        <w:instrText xml:space="preserve"> SEQ Figure \* ARABIC </w:instrText>
-      </w:r>
-      <w:r>
-        <w:fldChar w:fldCharType="separate"/>
-      </w:r>
-      <w:r>
-        <w:rPr>
-          <w:noProof/>
-        </w:rPr>
-        <w:t>7</w:t>
-      </w:r>
-      <w:r>
-        <w:rPr>
-          <w:noProof/>
-        </w:rPr>
-        <w:fldChar w:fldCharType="end"/>
-      </w:r>
+      <w:fldSimple w:instr=" SEQ Figure \* ARABIC ">
+        <w:r>
+          <w:rPr>
+            <w:noProof/>
+          </w:rPr>
+          <w:t>7</w:t>
+        </w:r>
+      </w:fldSimple>
       <w:bookmarkEnd w:id="19"/>
       <w:r>
         <w:t>: 555</w:t>
@@ -8272,9 +8274,11 @@
       <w:r>
         <w:t xml:space="preserve"> construct in </w:t>
       </w:r>
+      <w:proofErr w:type="spellStart"/>
       <w:r>
         <w:t>LTspice</w:t>
       </w:r>
+      <w:proofErr w:type="spellEnd"/>
       <w:r>
         <w:t>.</w:t>
       </w:r>
@@ -8293,9 +8297,11 @@
       <w:r>
         <w:t xml:space="preserve">to build the </w:t>
       </w:r>
+      <w:proofErr w:type="spellStart"/>
       <w:r>
         <w:t>LTspice</w:t>
       </w:r>
+      <w:proofErr w:type="spellEnd"/>
       <w:r>
         <w:t xml:space="preserve"> simulation </w:t>
       </w:r>
@@ -8341,7 +8347,10 @@
         <w:spacing w:before="100" w:beforeAutospacing="1" w:after="100" w:afterAutospacing="1" w:line="240" w:lineRule="auto"/>
       </w:pPr>
       <w:r>
-        <w:t>You can find the NE555 by searching for it in the component pop-up</w:t>
+        <w:t xml:space="preserve">You can find the NE555 by </w:t>
+      </w:r>
+      <w:r>
+        <w:t>selecting the component icon at the top of the window then searching for “NE555”</w:t>
       </w:r>
     </w:p>
     <w:p>
@@ -8354,8 +8363,24 @@
         <w:spacing w:before="100" w:beforeAutospacing="1" w:after="100" w:afterAutospacing="1" w:line="240" w:lineRule="auto"/>
       </w:pPr>
       <w:r>
-        <w:t>Use the components at the top of the LTspice window</w:t>
-      </w:r>
+        <w:t xml:space="preserve">Use the components at the top of the </w:t>
+      </w:r>
+      <w:proofErr w:type="spellStart"/>
+      <w:r>
+        <w:t>LTspice</w:t>
+      </w:r>
+      <w:proofErr w:type="spellEnd"/>
+      <w:r>
+        <w:t xml:space="preserve"> window</w:t>
+      </w:r>
+      <w:r>
+        <w:t xml:space="preserve"> for resistors, capacitors, </w:t>
+      </w:r>
+      <w:proofErr w:type="gramStart"/>
+      <w:r>
+        <w:t>etc..</w:t>
+      </w:r>
+      <w:proofErr w:type="gramEnd"/>
     </w:p>
     <w:p>
       <w:pPr>
@@ -8367,7 +8392,26 @@
         <w:spacing w:before="100" w:beforeAutospacing="1" w:after="100" w:afterAutospacing="1" w:line="240" w:lineRule="auto"/>
       </w:pPr>
       <w:r>
-        <w:t>Make sure to use the Label Net tool  to label the TRIG, OUT, RST, THRS and Vcc outputs</w:t>
+        <w:t xml:space="preserve">Make sure to use the Label Net </w:t>
+      </w:r>
+      <w:proofErr w:type="gramStart"/>
+      <w:r>
+        <w:t>tool  to</w:t>
+      </w:r>
+      <w:proofErr w:type="gramEnd"/>
+      <w:r>
+        <w:t xml:space="preserve"> label the TRIG, OUT, RST, THRS and </w:t>
+      </w:r>
+      <w:proofErr w:type="spellStart"/>
+      <w:r>
+        <w:t>Vcc</w:t>
+      </w:r>
+      <w:proofErr w:type="spellEnd"/>
+      <w:r>
+        <w:t xml:space="preserve"> </w:t>
+      </w:r>
+      <w:r>
+        <w:t>nets.</w:t>
       </w:r>
     </w:p>
     <w:p>
@@ -8405,9 +8449,11 @@
       <w:r>
         <w:t xml:space="preserve"> </w:t>
       </w:r>
+      <w:proofErr w:type="spellStart"/>
       <w:r>
         <w:t>ms</w:t>
       </w:r>
+      <w:proofErr w:type="spellEnd"/>
       <w:r>
         <w:t xml:space="preserve"> and while probing OUT and TRIG</w:t>
       </w:r>
@@ -8671,6 +8717,7 @@
         <w:spacing w:before="100" w:beforeAutospacing="1" w:after="100" w:afterAutospacing="1" w:line="240" w:lineRule="auto"/>
       </w:pPr>
       <w:r>
+        <w:lastRenderedPageBreak/>
         <w:t>Select the waveform window</w:t>
       </w:r>
     </w:p>
@@ -8684,7 +8731,6 @@
         <w:spacing w:before="100" w:beforeAutospacing="1" w:after="100" w:afterAutospacing="1" w:line="240" w:lineRule="auto"/>
       </w:pPr>
       <w:r>
-        <w:lastRenderedPageBreak/>
         <w:t xml:space="preserve">Left click on </w:t>
       </w:r>
       <w:r>
@@ -8724,7 +8770,15 @@
         <w:spacing w:before="100" w:beforeAutospacing="1" w:after="100" w:afterAutospacing="1" w:line="240" w:lineRule="auto"/>
       </w:pPr>
       <w:r>
-        <w:t>Right mouse click in the waveform window and select Place Cursor on Active Trace.</w:t>
+        <w:t xml:space="preserve">Right </w:t>
+      </w:r>
+      <w:proofErr w:type="gramStart"/>
+      <w:r>
+        <w:t>mouse</w:t>
+      </w:r>
+      <w:proofErr w:type="gramEnd"/>
+      <w:r>
+        <w:t xml:space="preserve"> click in the waveform window and select Place Cursor on Active Trace.</w:t>
       </w:r>
     </w:p>
     <w:p>
@@ -8797,10 +8851,7 @@
         <w:spacing w:before="100" w:beforeAutospacing="1" w:after="100" w:afterAutospacing="1" w:line="240" w:lineRule="auto"/>
       </w:pPr>
       <w:r>
-        <w:t>Manipulate the cursor to get the other values in</w:t>
-      </w:r>
-      <w:r>
-        <w:t xml:space="preserve"> </w:t>
+        <w:t xml:space="preserve">Manipulate the cursor to get the other values in </w:t>
       </w:r>
       <w:r>
         <w:fldChar w:fldCharType="begin"/>
@@ -8898,7 +8949,15 @@
         </w:rPr>
       </w:pPr>
       <w:r>
-        <w:t>Click on V(trig) at the top of the waveform window.</w:t>
+        <w:t>Click on V(</w:t>
+      </w:r>
+      <w:proofErr w:type="gramStart"/>
+      <w:r>
+        <w:t>trig</w:t>
+      </w:r>
+      <w:proofErr w:type="gramEnd"/>
+      <w:r>
+        <w:t>) at the top of the waveform window.</w:t>
       </w:r>
     </w:p>
     <w:p>
@@ -8915,7 +8974,15 @@
         </w:rPr>
       </w:pPr>
       <w:r>
-        <w:t xml:space="preserve">Repeat cursor steps used to measure OUT waveform and record your values in </w:t>
+        <w:t xml:space="preserve">Repeat cursor steps </w:t>
+      </w:r>
+      <w:proofErr w:type="gramStart"/>
+      <w:r>
+        <w:t>used</w:t>
+      </w:r>
+      <w:proofErr w:type="gramEnd"/>
+      <w:r>
+        <w:t xml:space="preserve"> to measure OUT waveform and record your values in </w:t>
       </w:r>
       <w:r>
         <w:fldChar w:fldCharType="begin"/>
@@ -9098,7 +9165,15 @@
         <w:t>do not</w:t>
       </w:r>
       <w:r>
-        <w:t xml:space="preserve"> solder in any of the other components in any of the other subsystems. </w:t>
+        <w:t xml:space="preserve"> </w:t>
+      </w:r>
+      <w:proofErr w:type="gramStart"/>
+      <w:r>
+        <w:t>solder</w:t>
+      </w:r>
+      <w:proofErr w:type="gramEnd"/>
+      <w:r>
+        <w:t xml:space="preserve"> in any of the other components in any of the other subsystems. </w:t>
       </w:r>
       <w:r>
         <w:t xml:space="preserve"> This lab document contains cursory coverage of the assembly process. You can find much more detail in the Assembly Guide posted on Canvas.</w:t>
@@ -9115,7 +9190,7 @@
         </w:rPr>
         <w:lastRenderedPageBreak/>
         <w:drawing>
-          <wp:inline distT="0" distB="0" distL="0" distR="0" wp14:anchorId="1E6A453F" wp14:editId="48368F7D">
+          <wp:inline distT="0" distB="0" distL="0" distR="0" wp14:anchorId="1E6A453F" wp14:editId="4483360D">
             <wp:extent cx="5400000" cy="4178894"/>
             <wp:effectExtent l="0" t="0" r="0" b="0"/>
             <wp:docPr id="50502654" name="Picture 1"/>
@@ -9172,27 +9247,14 @@
       <w:r>
         <w:t xml:space="preserve">Figure </w:t>
       </w:r>
-      <w:r>
-        <w:fldChar w:fldCharType="begin"/>
-      </w:r>
-      <w:r>
-        <w:instrText xml:space="preserve"> SEQ Figure \* ARABIC </w:instrText>
-      </w:r>
-      <w:r>
-        <w:fldChar w:fldCharType="separate"/>
-      </w:r>
-      <w:r>
-        <w:rPr>
-          <w:noProof/>
-        </w:rPr>
-        <w:t>8</w:t>
-      </w:r>
-      <w:r>
-        <w:rPr>
-          <w:noProof/>
-        </w:rPr>
-        <w:fldChar w:fldCharType="end"/>
-      </w:r>
+      <w:fldSimple w:instr=" SEQ Figure \* ARABIC ">
+        <w:r>
+          <w:rPr>
+            <w:noProof/>
+          </w:rPr>
+          <w:t>8</w:t>
+        </w:r>
+      </w:fldSimple>
       <w:bookmarkEnd w:id="24"/>
       <w:r>
         <w:t xml:space="preserve">: The schematic for the BJT curve tracer. </w:t>
@@ -9262,11 +9324,16 @@
         <w:t xml:space="preserve">enables </w:t>
       </w:r>
       <w:r>
-        <w:t>you to supply power to the BJT curve tracer board from either a</w:t>
+        <w:t xml:space="preserve">you to supply power to the BJT curve tracer board from either </w:t>
+      </w:r>
+      <w:proofErr w:type="gramStart"/>
+      <w:r>
+        <w:t>a</w:t>
       </w:r>
       <w:r>
         <w:t>n</w:t>
       </w:r>
+      <w:proofErr w:type="gramEnd"/>
       <w:r>
         <w:t xml:space="preserve"> </w:t>
       </w:r>
@@ -9292,10 +9359,26 @@
         <w:t xml:space="preserve"> terminals</w:t>
       </w:r>
       <w:r>
-        <w:t>.  A SPDT slide switch allows the user to turn the BJT curve tracer on or off while leaving the power input connected.  An indicator LED confirms the BJT curve tracer is powered on when it is illuminated.  A pair of capacitors smooths out the power delivered to the BJT curve tracer.</w:t>
-      </w:r>
-      <w:r>
-        <w:t xml:space="preserve">  Finally, a MOSFET disconnects the power input if you accidently reverse the positive and negative power leads.</w:t>
+        <w:t xml:space="preserve">.  A SPDT slide switch allows the user to turn the BJT curve tracer on or off while leaving the power input connected.  An indicator LED confirms the BJT curve tracer is powered on when it is illuminated.  A pair of capacitors </w:t>
+      </w:r>
+      <w:proofErr w:type="gramStart"/>
+      <w:r>
+        <w:t>smooths</w:t>
+      </w:r>
+      <w:proofErr w:type="gramEnd"/>
+      <w:r>
+        <w:t xml:space="preserve"> out the power delivered to the BJT curve tracer.</w:t>
+      </w:r>
+      <w:r>
+        <w:t xml:space="preserve">  Finally, a MOSFET disconnects the power input if you </w:t>
+      </w:r>
+      <w:proofErr w:type="gramStart"/>
+      <w:r>
+        <w:t>accidently</w:t>
+      </w:r>
+      <w:proofErr w:type="gramEnd"/>
+      <w:r>
+        <w:t xml:space="preserve"> reverse the positive and negative power leads.</w:t>
       </w:r>
       <w:r>
         <w:t xml:space="preserve">  You will learn more about this MOSFET in a later lab.</w:t>
@@ -9527,17 +9610,41 @@
     </w:p>
     <w:p>
       <w:r>
-        <w:t xml:space="preserve">Most of the parts you will solder into the PCB can be installed in more than one way.  Parts which must be installed in a correct orientation are called polarized.  </w:t>
-      </w:r>
-      <w:r>
-        <w:t xml:space="preserve">If you would like to </w:t>
+        <w:t xml:space="preserve">Most of the parts you will </w:t>
+      </w:r>
+      <w:proofErr w:type="gramStart"/>
+      <w:r>
+        <w:t>solder</w:t>
+      </w:r>
+      <w:proofErr w:type="gramEnd"/>
+      <w:r>
+        <w:t xml:space="preserve"> into the PCB can be installed in more than one way.  Parts which must be installed in a correct orientation are called polarized.  </w:t>
+      </w:r>
+      <w:r>
+        <w:t xml:space="preserve">If you would </w:t>
+      </w:r>
+      <w:proofErr w:type="gramStart"/>
+      <w:r>
+        <w:t>like to</w:t>
+      </w:r>
+      <w:proofErr w:type="gramEnd"/>
+      <w:r>
+        <w:t xml:space="preserve"> </w:t>
       </w:r>
       <w:r>
         <w:t xml:space="preserve">more </w:t>
       </w:r>
       <w:r>
         <w:lastRenderedPageBreak/>
-        <w:t>information about the polarized parts you will install in your board, please check the Assembly Guide.</w:t>
+        <w:t xml:space="preserve">information about the polarized parts you will install </w:t>
+      </w:r>
+      <w:proofErr w:type="gramStart"/>
+      <w:r>
+        <w:t>in</w:t>
+      </w:r>
+      <w:proofErr w:type="gramEnd"/>
+      <w:r>
+        <w:t xml:space="preserve"> your board, please check the Assembly Guide.</w:t>
       </w:r>
     </w:p>
     <w:p>
@@ -9577,10 +9684,18 @@
         <w:t xml:space="preserve"> that you will</w:t>
       </w:r>
       <w:r>
-        <w:t xml:space="preserve"> connect </w:t>
-      </w:r>
-      <w:r>
-        <w:t xml:space="preserve">together </w:t>
+        <w:t xml:space="preserve"> </w:t>
+      </w:r>
+      <w:proofErr w:type="gramStart"/>
+      <w:r>
+        <w:t xml:space="preserve">connect </w:t>
+      </w:r>
+      <w:r>
+        <w:t>together</w:t>
+      </w:r>
+      <w:proofErr w:type="gramEnd"/>
+      <w:r>
+        <w:t xml:space="preserve"> </w:t>
       </w:r>
       <w:r>
         <w:t>with a</w:t>
@@ -9616,7 +9731,15 @@
         <w:t xml:space="preserve">.  </w:t>
       </w:r>
       <w:r>
-        <w:t xml:space="preserve">These wire loops make it easy to connect oscilloscope probes and alligator clips to your to your circuit.  Consult </w:t>
+        <w:t xml:space="preserve">These wire loops make it easy to connect oscilloscope probes and alligator clips to </w:t>
+      </w:r>
+      <w:proofErr w:type="gramStart"/>
+      <w:r>
+        <w:t>your</w:t>
+      </w:r>
+      <w:proofErr w:type="gramEnd"/>
+      <w:r>
+        <w:t xml:space="preserve"> to your circuit.  Consult </w:t>
       </w:r>
       <w:r>
         <w:t xml:space="preserve">the Assembly Guide for a </w:t>
@@ -9646,7 +9769,23 @@
         <w:ind w:left="0" w:firstLine="0"/>
       </w:pPr>
       <w:r>
-        <w:t xml:space="preserve">The BJT Curve Tracer has many loose thru-hole resistors of different values.  It is worth your time to become familiar on how to interpret the resistors’ color bands.  We will use the handy table in </w:t>
+        <w:t xml:space="preserve">The BJT Curve Tracer has many loose </w:t>
+      </w:r>
+      <w:proofErr w:type="gramStart"/>
+      <w:r>
+        <w:t>thru</w:t>
+      </w:r>
+      <w:proofErr w:type="gramEnd"/>
+      <w:r>
+        <w:t xml:space="preserve">-hole resistors of different values.  It is worth your time to become familiar </w:t>
+      </w:r>
+      <w:proofErr w:type="gramStart"/>
+      <w:r>
+        <w:t>on</w:t>
+      </w:r>
+      <w:proofErr w:type="gramEnd"/>
+      <w:r>
+        <w:t xml:space="preserve"> how to interpret the resistors’ color bands.  We will use the handy table in </w:t>
       </w:r>
       <w:r>
         <w:fldChar w:fldCharType="begin"/>
@@ -9741,27 +9880,14 @@
       <w:r>
         <w:t xml:space="preserve">Figure </w:t>
       </w:r>
-      <w:r>
-        <w:fldChar w:fldCharType="begin"/>
-      </w:r>
-      <w:r>
-        <w:instrText xml:space="preserve"> SEQ Figure \* ARABIC </w:instrText>
-      </w:r>
-      <w:r>
-        <w:fldChar w:fldCharType="separate"/>
-      </w:r>
-      <w:r>
-        <w:rPr>
-          <w:noProof/>
-        </w:rPr>
-        <w:t>9</w:t>
-      </w:r>
-      <w:r>
-        <w:rPr>
-          <w:noProof/>
-        </w:rPr>
-        <w:fldChar w:fldCharType="end"/>
-      </w:r>
+      <w:fldSimple w:instr=" SEQ Figure \* ARABIC ">
+        <w:r>
+          <w:rPr>
+            <w:noProof/>
+          </w:rPr>
+          <w:t>9</w:t>
+        </w:r>
+      </w:fldSimple>
       <w:bookmarkEnd w:id="26"/>
       <w:r>
         <w:t>: The colored bands on resistors indicate their resistance value.</w:t>
@@ -9802,7 +9928,63 @@
         <w:t>±</w:t>
       </w:r>
       <w:r>
-        <w:t xml:space="preserve">5%   The first three bands are the resistance, in this case 22 kΩ.  The fourth band is the range of resistances you can expect the resistor to have.  This phrase means the actual resistance of the example resistor could be as low as 22 kΩ – 0.05*22 kΩ = 22 kΩ – 1.1 kΩ = 20.9 kΩ or as high as 23.1 kΩ. </w:t>
+        <w:t xml:space="preserve">5%   The first three bands are the resistance, in this case 22 </w:t>
+      </w:r>
+      <w:proofErr w:type="spellStart"/>
+      <w:r>
+        <w:t>kΩ</w:t>
+      </w:r>
+      <w:proofErr w:type="spellEnd"/>
+      <w:r>
+        <w:t xml:space="preserve">.  The fourth band is the range of resistances you can expect the resistor to have.  This phrase means the actual resistance of the example resistor could be as low as 22 </w:t>
+      </w:r>
+      <w:proofErr w:type="spellStart"/>
+      <w:r>
+        <w:t>kΩ</w:t>
+      </w:r>
+      <w:proofErr w:type="spellEnd"/>
+      <w:r>
+        <w:t xml:space="preserve"> – 0.05*22 </w:t>
+      </w:r>
+      <w:proofErr w:type="spellStart"/>
+      <w:r>
+        <w:t>kΩ</w:t>
+      </w:r>
+      <w:proofErr w:type="spellEnd"/>
+      <w:r>
+        <w:t xml:space="preserve"> = 22 </w:t>
+      </w:r>
+      <w:proofErr w:type="spellStart"/>
+      <w:r>
+        <w:t>kΩ</w:t>
+      </w:r>
+      <w:proofErr w:type="spellEnd"/>
+      <w:r>
+        <w:t xml:space="preserve"> – 1.1 </w:t>
+      </w:r>
+      <w:proofErr w:type="spellStart"/>
+      <w:r>
+        <w:t>kΩ</w:t>
+      </w:r>
+      <w:proofErr w:type="spellEnd"/>
+      <w:r>
+        <w:t xml:space="preserve"> = 20.9 </w:t>
+      </w:r>
+      <w:proofErr w:type="spellStart"/>
+      <w:r>
+        <w:t>kΩ</w:t>
+      </w:r>
+      <w:proofErr w:type="spellEnd"/>
+      <w:r>
+        <w:t xml:space="preserve"> or as high as 23.1 </w:t>
+      </w:r>
+      <w:proofErr w:type="spellStart"/>
+      <w:r>
+        <w:t>kΩ</w:t>
+      </w:r>
+      <w:proofErr w:type="spellEnd"/>
+      <w:r>
+        <w:t xml:space="preserve">. </w:t>
       </w:r>
       <w:r>
         <w:t>Check your understanding by filling in</w:t>
@@ -9852,27 +10034,14 @@
         <w:lastRenderedPageBreak/>
         <w:t xml:space="preserve">Table </w:t>
       </w:r>
-      <w:r>
-        <w:fldChar w:fldCharType="begin"/>
-      </w:r>
-      <w:r>
-        <w:instrText xml:space="preserve"> SEQ Table \* ARABIC </w:instrText>
-      </w:r>
-      <w:r>
-        <w:fldChar w:fldCharType="separate"/>
-      </w:r>
-      <w:r>
-        <w:rPr>
-          <w:noProof/>
-        </w:rPr>
-        <w:t>2</w:t>
-      </w:r>
-      <w:r>
-        <w:rPr>
-          <w:noProof/>
-        </w:rPr>
-        <w:fldChar w:fldCharType="end"/>
-      </w:r>
+      <w:fldSimple w:instr=" SEQ Table \* ARABIC ">
+        <w:r>
+          <w:rPr>
+            <w:noProof/>
+          </w:rPr>
+          <w:t>2</w:t>
+        </w:r>
+      </w:fldSimple>
       <w:bookmarkEnd w:id="27"/>
       <w:r>
         <w:t>: Complete the missing entries in the table of resistance color codes.</w:t>
@@ -11429,27 +11598,14 @@
       <w:r>
         <w:t xml:space="preserve">Table </w:t>
       </w:r>
-      <w:r>
-        <w:fldChar w:fldCharType="begin"/>
-      </w:r>
-      <w:r>
-        <w:instrText xml:space="preserve"> SEQ Table \* ARABIC </w:instrText>
-      </w:r>
-      <w:r>
-        <w:fldChar w:fldCharType="separate"/>
-      </w:r>
-      <w:r>
-        <w:rPr>
-          <w:noProof/>
-        </w:rPr>
-        <w:t>3</w:t>
-      </w:r>
-      <w:r>
-        <w:rPr>
-          <w:noProof/>
-        </w:rPr>
-        <w:fldChar w:fldCharType="end"/>
-      </w:r>
+      <w:fldSimple w:instr=" SEQ Table \* ARABIC ">
+        <w:r>
+          <w:rPr>
+            <w:noProof/>
+          </w:rPr>
+          <w:t>3</w:t>
+        </w:r>
+      </w:fldSimple>
       <w:bookmarkEnd w:id="28"/>
       <w:r>
         <w:t>: Match the schematic symbol with the corresponding part.</w:t>
@@ -12505,10 +12661,10 @@
                   <v:path o:extrusionok="f" gradientshapeok="t" o:connecttype="rect"/>
                   <o:lock v:ext="edit" aspectratio="t"/>
                 </v:shapetype>
-                <v:shape id="_x0000_i1025" type="#_x0000_t75" style="width:53.65pt;height:54.35pt" o:ole="">
+                <v:shape id="_x0000_i1025" type="#_x0000_t75" style="width:54pt;height:54pt" o:ole="">
                   <v:imagedata r:id="rId30" o:title=""/>
                 </v:shape>
-                <o:OLEObject Type="Embed" ProgID="PBrush" ShapeID="_x0000_i1025" DrawAspect="Content" ObjectID="_1842345670" r:id="rId31"/>
+                <o:OLEObject Type="Embed" ProgID="PBrush" ShapeID="_x0000_i1025" DrawAspect="Content" ObjectID="_1842715672" r:id="rId31"/>
               </w:object>
             </w:r>
           </w:p>
@@ -12762,10 +12918,10 @@
             </w:r>
             <w:r>
               <w:object w:dxaOrig="3696" w:dyaOrig="5040" w14:anchorId="24D8BBC0">
-                <v:shape id="_x0000_i1026" type="#_x0000_t75" style="width:42.1pt;height:53.65pt" o:ole="">
+                <v:shape id="_x0000_i1026" type="#_x0000_t75" style="width:42pt;height:54pt" o:ole="">
                   <v:imagedata r:id="rId35" o:title=""/>
                 </v:shape>
-                <o:OLEObject Type="Embed" ProgID="PBrush" ShapeID="_x0000_i1026" DrawAspect="Content" ObjectID="_1842345671" r:id="rId36"/>
+                <o:OLEObject Type="Embed" ProgID="PBrush" ShapeID="_x0000_i1026" DrawAspect="Content" ObjectID="_1842715673" r:id="rId36"/>
               </w:object>
             </w:r>
           </w:p>
@@ -13041,7 +13197,15 @@
     </w:p>
     <w:p>
       <w:r>
-        <w:t>You should take care and align the resistors so their gold tolerance bands all fac</w:t>
+        <w:t xml:space="preserve">You should take care and align the </w:t>
+      </w:r>
+      <w:proofErr w:type="gramStart"/>
+      <w:r>
+        <w:t>resistors</w:t>
+      </w:r>
+      <w:proofErr w:type="gramEnd"/>
+      <w:r>
+        <w:t xml:space="preserve"> so their gold tolerance bands all fac</w:t>
       </w:r>
       <w:r>
         <w:t>ing</w:t>
@@ -13156,8 +13320,17 @@
                 <w:b w:val="0"/>
                 <w:bCs w:val="0"/>
               </w:rPr>
-              <w:t>555PULSE testpoint</w:t>
+              <w:t xml:space="preserve">555PULSE </w:t>
             </w:r>
+            <w:proofErr w:type="spellStart"/>
+            <w:r>
+              <w:rPr>
+                <w:b w:val="0"/>
+                <w:bCs w:val="0"/>
+              </w:rPr>
+              <w:t>testpoint</w:t>
+            </w:r>
+            <w:proofErr w:type="spellEnd"/>
           </w:p>
         </w:tc>
       </w:tr>
@@ -13588,9 +13761,11 @@
       <w:r>
         <w:t xml:space="preserve">Set the GND reference of Ch 1 and Ch 2 to the lowest visible reticule. The waveforms will overlap the same as they did in the </w:t>
       </w:r>
+      <w:proofErr w:type="spellStart"/>
       <w:r>
         <w:t>LTspice</w:t>
       </w:r>
+      <w:proofErr w:type="spellEnd"/>
       <w:r>
         <w:t xml:space="preserve"> simulation.  The TRI pin of the 555 Timer is available by </w:t>
       </w:r>
@@ -13760,27 +13935,14 @@
       <w:r>
         <w:t xml:space="preserve">Figure </w:t>
       </w:r>
-      <w:r>
-        <w:fldChar w:fldCharType="begin"/>
-      </w:r>
-      <w:r>
-        <w:instrText xml:space="preserve"> SEQ Figure \* ARABIC </w:instrText>
-      </w:r>
-      <w:r>
-        <w:fldChar w:fldCharType="separate"/>
-      </w:r>
-      <w:r>
-        <w:rPr>
-          <w:noProof/>
-        </w:rPr>
-        <w:t>10</w:t>
-      </w:r>
-      <w:r>
-        <w:rPr>
-          <w:noProof/>
-        </w:rPr>
-        <w:fldChar w:fldCharType="end"/>
-      </w:r>
+      <w:fldSimple w:instr=" SEQ Figure \* ARABIC ">
+        <w:r>
+          <w:rPr>
+            <w:noProof/>
+          </w:rPr>
+          <w:t>10</w:t>
+        </w:r>
+      </w:fldSimple>
       <w:bookmarkEnd w:id="30"/>
       <w:r>
         <w:t xml:space="preserve">: </w:t>
@@ -13805,10 +13967,26 @@
         <w:t xml:space="preserve"> oscilloscope trace </w:t>
       </w:r>
       <w:r>
-        <w:t xml:space="preserve">showing the two output you need to capture.  Note that this image </w:t>
-      </w:r>
-      <w:r>
-        <w:t>was captured on a Rhode&amp;Schwarz HMO724.</w:t>
+        <w:t xml:space="preserve">showing the two </w:t>
+      </w:r>
+      <w:proofErr w:type="gramStart"/>
+      <w:r>
+        <w:t>output</w:t>
+      </w:r>
+      <w:proofErr w:type="gramEnd"/>
+      <w:r>
+        <w:t xml:space="preserve"> you need to capture.  Note that this image </w:t>
+      </w:r>
+      <w:r>
+        <w:t xml:space="preserve">was captured on a </w:t>
+      </w:r>
+      <w:proofErr w:type="spellStart"/>
+      <w:r>
+        <w:t>Rhode&amp;Schwarz</w:t>
+      </w:r>
+      <w:proofErr w:type="spellEnd"/>
+      <w:r>
+        <w:t xml:space="preserve"> HMO724.</w:t>
       </w:r>
       <w:bookmarkEnd w:id="31"/>
     </w:p>
@@ -14072,27 +14250,14 @@
       <w:r>
         <w:t xml:space="preserve">Table </w:t>
       </w:r>
-      <w:r>
-        <w:fldChar w:fldCharType="begin"/>
-      </w:r>
-      <w:r>
-        <w:instrText xml:space="preserve"> SEQ Table \* ARABIC </w:instrText>
-      </w:r>
-      <w:r>
-        <w:fldChar w:fldCharType="separate"/>
-      </w:r>
-      <w:r>
-        <w:rPr>
-          <w:noProof/>
-        </w:rPr>
-        <w:t>4</w:t>
-      </w:r>
-      <w:r>
-        <w:rPr>
-          <w:noProof/>
-        </w:rPr>
-        <w:fldChar w:fldCharType="end"/>
-      </w:r>
+      <w:fldSimple w:instr=" SEQ Table \* ARABIC ">
+        <w:r>
+          <w:rPr>
+            <w:noProof/>
+          </w:rPr>
+          <w:t>4</w:t>
+        </w:r>
+      </w:fldSimple>
       <w:bookmarkEnd w:id="37"/>
       <w:r>
         <w:t>: Comparison of the timer output from analysis, simulation and the actual circuit.</w:t>
@@ -14717,7 +14882,15 @@
       </w:pPr>
       <w:r>
         <w:lastRenderedPageBreak/>
-        <w:t>Hint, use Ctrl+click to follow links.  This also works for all the Figures and Tables in these labs.</w:t>
+        <w:t xml:space="preserve">Hint, use </w:t>
+      </w:r>
+      <w:proofErr w:type="spellStart"/>
+      <w:r>
+        <w:t>Ctrl+click</w:t>
+      </w:r>
+      <w:proofErr w:type="spellEnd"/>
+      <w:r>
+        <w:t xml:space="preserve"> to follow links.  This also works for all the Figures and Tables in these labs.</w:t>
       </w:r>
     </w:p>
     <w:p>
@@ -14847,6 +15020,7 @@
         </w:rPr>
         <w:tab/>
       </w:r>
+      <w:proofErr w:type="gramStart"/>
       <w:r>
         <w:rPr>
           <w:bCs/>
@@ -14882,7 +15056,14 @@
         <w:rPr>
           <w:bCs/>
         </w:rPr>
-        <w:t>vs. TRI state</w:t>
+        <w:t>vs.</w:t>
+      </w:r>
+      <w:proofErr w:type="gramEnd"/>
+      <w:r>
+        <w:rPr>
+          <w:bCs/>
+        </w:rPr>
+        <w:t xml:space="preserve"> TRI state</w:t>
       </w:r>
     </w:p>
     <w:p>

</xml_diff>

<commit_message>
pspice update on lab10 and lab11
</commit_message>
<xml_diff>
--- a/Labs/lab10 curveTracer 555timer/curveTracer 555timer Document.docx
+++ b/Labs/lab10 curveTracer 555timer/curveTracer 555timer Document.docx
@@ -1044,7 +1044,158 @@
         </w:rPr>
         <w:t>s.</w:t>
       </w:r>
+      <w:r>
+        <w:rPr>
+          <w:iCs/>
+        </w:rPr>
+        <w:t xml:space="preserve">  </w:t>
+      </w:r>
     </w:p>
+    <w:tbl>
+      <w:tblPr>
+        <w:tblStyle w:val="TableGrid"/>
+        <w:tblpPr w:leftFromText="180" w:rightFromText="180" w:vertAnchor="text" w:horzAnchor="page" w:tblpX="6094" w:tblpY="1123"/>
+        <w:tblW w:w="0" w:type="auto"/>
+        <w:tblLook w:val="04A0" w:firstRow="1" w:lastRow="0" w:firstColumn="1" w:lastColumn="0" w:noHBand="0" w:noVBand="1"/>
+      </w:tblPr>
+      <w:tblGrid>
+        <w:gridCol w:w="2515"/>
+        <w:gridCol w:w="2700"/>
+      </w:tblGrid>
+      <w:tr>
+        <w:tc>
+          <w:tcPr>
+            <w:tcW w:w="2515" w:type="dxa"/>
+          </w:tcPr>
+          <w:p>
+            <w:pPr>
+              <w:spacing w:before="100" w:beforeAutospacing="1" w:after="0" w:line="240" w:lineRule="auto"/>
+              <w:ind w:left="0" w:firstLine="0"/>
+            </w:pPr>
+            <w:r>
+              <w:t>Net Names</w:t>
+            </w:r>
+          </w:p>
+        </w:tc>
+        <w:tc>
+          <w:tcPr>
+            <w:tcW w:w="2700" w:type="dxa"/>
+          </w:tcPr>
+          <w:p>
+            <w:pPr>
+              <w:spacing w:before="100" w:beforeAutospacing="1" w:after="0" w:line="240" w:lineRule="auto"/>
+              <w:ind w:left="0" w:firstLine="0"/>
+            </w:pPr>
+            <w:r>
+              <w:t xml:space="preserve">trig, out, </w:t>
+            </w:r>
+            <w:proofErr w:type="spellStart"/>
+            <w:r>
+              <w:t>Vcc</w:t>
+            </w:r>
+            <w:proofErr w:type="spellEnd"/>
+            <w:r>
+              <w:t xml:space="preserve">, </w:t>
+            </w:r>
+          </w:p>
+        </w:tc>
+      </w:tr>
+      <w:tr>
+        <w:tc>
+          <w:tcPr>
+            <w:tcW w:w="2515" w:type="dxa"/>
+          </w:tcPr>
+          <w:p>
+            <w:pPr>
+              <w:spacing w:before="100" w:beforeAutospacing="1" w:after="0" w:line="240" w:lineRule="auto"/>
+              <w:ind w:left="0" w:firstLine="0"/>
+            </w:pPr>
+            <w:r>
+              <w:t>Component</w:t>
+            </w:r>
+          </w:p>
+        </w:tc>
+        <w:tc>
+          <w:tcPr>
+            <w:tcW w:w="2700" w:type="dxa"/>
+          </w:tcPr>
+          <w:p>
+            <w:pPr>
+              <w:spacing w:before="100" w:beforeAutospacing="1" w:after="0" w:line="240" w:lineRule="auto"/>
+              <w:ind w:left="0" w:firstLine="0"/>
+            </w:pPr>
+            <w:r>
+              <w:t>NE555</w:t>
+            </w:r>
+          </w:p>
+        </w:tc>
+      </w:tr>
+      <w:tr>
+        <w:tc>
+          <w:tcPr>
+            <w:tcW w:w="2515" w:type="dxa"/>
+          </w:tcPr>
+          <w:p>
+            <w:pPr>
+              <w:spacing w:before="100" w:beforeAutospacing="1" w:after="0" w:line="240" w:lineRule="auto"/>
+              <w:ind w:left="0" w:firstLine="0"/>
+            </w:pPr>
+            <w:r>
+              <w:t>Waveform Nets</w:t>
+            </w:r>
+          </w:p>
+        </w:tc>
+        <w:tc>
+          <w:tcPr>
+            <w:tcW w:w="2700" w:type="dxa"/>
+          </w:tcPr>
+          <w:p>
+            <w:pPr>
+              <w:spacing w:before="100" w:beforeAutospacing="1" w:after="0" w:line="240" w:lineRule="auto"/>
+              <w:ind w:left="0" w:firstLine="0"/>
+            </w:pPr>
+            <w:proofErr w:type="gramStart"/>
+            <w:r>
+              <w:t>trig</w:t>
+            </w:r>
+            <w:proofErr w:type="gramEnd"/>
+            <w:r>
+              <w:t>, out</w:t>
+            </w:r>
+          </w:p>
+        </w:tc>
+      </w:tr>
+      <w:tr>
+        <w:tc>
+          <w:tcPr>
+            <w:tcW w:w="2515" w:type="dxa"/>
+          </w:tcPr>
+          <w:p>
+            <w:pPr>
+              <w:spacing w:before="100" w:beforeAutospacing="1" w:after="0" w:line="240" w:lineRule="auto"/>
+              <w:ind w:left="0" w:firstLine="0"/>
+            </w:pPr>
+            <w:r>
+              <w:t>Configure Analysis</w:t>
+            </w:r>
+          </w:p>
+        </w:tc>
+        <w:tc>
+          <w:tcPr>
+            <w:tcW w:w="2700" w:type="dxa"/>
+          </w:tcPr>
+          <w:p>
+            <w:pPr>
+              <w:spacing w:before="100" w:beforeAutospacing="1" w:after="0" w:line="240" w:lineRule="auto"/>
+              <w:ind w:left="0" w:firstLine="0"/>
+            </w:pPr>
+            <w:r>
+              <w:t>Transient, Stop Time 5ms</w:t>
+            </w:r>
+          </w:p>
+        </w:tc>
+      </w:tr>
+    </w:tbl>
     <w:p>
       <w:pPr>
         <w:keepNext/>
@@ -1055,10 +1206,10 @@
           <w:noProof/>
         </w:rPr>
         <w:drawing>
-          <wp:inline distT="0" distB="0" distL="0" distR="0" wp14:anchorId="5AAB5ED8" wp14:editId="22A25228">
-            <wp:extent cx="2737353" cy="2286000"/>
-            <wp:effectExtent l="0" t="0" r="6350" b="0"/>
-            <wp:docPr id="28655524" name="Picture 1"/>
+          <wp:inline distT="0" distB="0" distL="0" distR="0" wp14:anchorId="553A6277" wp14:editId="3D59F4E0">
+            <wp:extent cx="2743200" cy="1946324"/>
+            <wp:effectExtent l="0" t="0" r="0" b="0"/>
+            <wp:docPr id="1180852106" name="Picture 13"/>
             <wp:cNvGraphicFramePr>
               <a:graphicFrameLocks xmlns:a="http://schemas.openxmlformats.org/drawingml/2006/main" noChangeAspect="1"/>
             </wp:cNvGraphicFramePr>
@@ -1066,23 +1217,36 @@
               <a:graphicData uri="http://schemas.openxmlformats.org/drawingml/2006/picture">
                 <pic:pic xmlns:pic="http://schemas.openxmlformats.org/drawingml/2006/picture">
                   <pic:nvPicPr>
-                    <pic:cNvPr id="28655524" name=""/>
-                    <pic:cNvPicPr/>
+                    <pic:cNvPr id="0" name="Picture 3"/>
+                    <pic:cNvPicPr>
+                      <a:picLocks noChangeAspect="1" noChangeArrowheads="1"/>
+                    </pic:cNvPicPr>
                   </pic:nvPicPr>
                   <pic:blipFill>
-                    <a:blip r:embed="rId8"/>
+                    <a:blip r:embed="rId8" cstate="print">
+                      <a:extLst>
+                        <a:ext uri="{28A0092B-C50C-407E-A947-70E740481C1C}">
+                          <a14:useLocalDpi xmlns:a14="http://schemas.microsoft.com/office/drawing/2010/main" val="0"/>
+                        </a:ext>
+                      </a:extLst>
+                    </a:blip>
+                    <a:srcRect/>
                     <a:stretch>
                       <a:fillRect/>
                     </a:stretch>
                   </pic:blipFill>
-                  <pic:spPr>
+                  <pic:spPr bwMode="auto">
                     <a:xfrm>
                       <a:off x="0" y="0"/>
-                      <a:ext cx="2737353" cy="2286000"/>
+                      <a:ext cx="2743200" cy="1946324"/>
                     </a:xfrm>
                     <a:prstGeom prst="rect">
                       <a:avLst/>
                     </a:prstGeom>
+                    <a:noFill/>
+                    <a:ln>
+                      <a:noFill/>
+                    </a:ln>
                   </pic:spPr>
                 </pic:pic>
               </a:graphicData>
@@ -1396,14 +1560,7 @@
         <w:rPr>
           <w:iCs/>
         </w:rPr>
-        <w:t xml:space="preserve">, so to simplify the explanation, they are omitted.  </w:t>
-      </w:r>
-      <w:r>
-        <w:rPr>
-          <w:iCs/>
-        </w:rPr>
-        <w:lastRenderedPageBreak/>
-        <w:t xml:space="preserve">Finally, note that VCC is the system voltage in </w:t>
+        <w:t xml:space="preserve">, so to simplify the explanation, they are omitted.  Finally, note that VCC is the system voltage in </w:t>
       </w:r>
       <w:r>
         <w:rPr>
@@ -1470,6 +1627,7 @@
         <w:rPr>
           <w:noProof/>
         </w:rPr>
+        <w:lastRenderedPageBreak/>
         <w:drawing>
           <wp:inline distT="0" distB="0" distL="0" distR="0" wp14:anchorId="2AACBF18" wp14:editId="0479DABD">
             <wp:extent cx="3630168" cy="1533125"/>
@@ -2915,7 +3073,6 @@
         <w:rPr>
           <w:iCs/>
         </w:rPr>
-        <w:lastRenderedPageBreak/>
         <w:t xml:space="preserve">The last element of </w:t>
       </w:r>
       <w:r>
@@ -3142,7 +3299,14 @@
         <w:rPr>
           <w:iCs/>
         </w:rPr>
-        <w:t xml:space="preserve"> the switch is open, leaving the DIS pin “floating”, not connected to any voltage.</w:t>
+        <w:t xml:space="preserve"> the switch is open, </w:t>
+      </w:r>
+      <w:r>
+        <w:rPr>
+          <w:iCs/>
+        </w:rPr>
+        <w:lastRenderedPageBreak/>
+        <w:t>leaving the DIS pin “floating”, not connected to any voltage.</w:t>
       </w:r>
       <w:r>
         <w:rPr>
@@ -3786,7 +3950,7 @@
           <w:noProof/>
         </w:rPr>
         <w:drawing>
-          <wp:inline distT="0" distB="0" distL="0" distR="0" wp14:anchorId="391330D9" wp14:editId="6347C44E">
+          <wp:inline distT="0" distB="0" distL="0" distR="0" wp14:anchorId="391330D9" wp14:editId="3D9D5B44">
             <wp:extent cx="3032702" cy="1553952"/>
             <wp:effectExtent l="0" t="0" r="0" b="8255"/>
             <wp:docPr id="20" name="Picture 20"/>
@@ -8134,6 +8298,9 @@
       <w:pPr>
         <w:spacing w:before="100" w:beforeAutospacing="1" w:after="100" w:afterAutospacing="1" w:line="240" w:lineRule="auto"/>
         <w:ind w:left="0" w:firstLine="0"/>
+        <w:rPr>
+          <w:vanish/>
+        </w:rPr>
       </w:pPr>
       <w:r>
         <w:t xml:space="preserve">Use the skills learned in Lab 0 to </w:t>
@@ -8148,21 +8315,32 @@
         <w:t xml:space="preserve"> </w:t>
       </w:r>
       <w:r>
-        <w:t>circuit analyzed in the previous section</w:t>
-      </w:r>
-      <w:r>
-        <w:t xml:space="preserve"> to build the circuit shown</w:t>
-      </w:r>
-      <w:r>
-        <w:t xml:space="preserve"> in </w:t>
-      </w:r>
-      <w:r>
+        <w:t xml:space="preserve">circuit </w:t>
+      </w:r>
+      <w:r>
+        <w:t xml:space="preserve">shown in </w:t>
+      </w:r>
+      <w:r>
+        <w:rPr>
+          <w:iCs/>
+        </w:rPr>
         <w:fldChar w:fldCharType="begin"/>
       </w:r>
       <w:r>
-        <w:instrText xml:space="preserve"> REF _Ref93329208 \h </w:instrText>
-      </w:r>
-      <w:r>
+        <w:rPr>
+          <w:iCs/>
+        </w:rPr>
+        <w:instrText xml:space="preserve"> REF _Ref80215322 \h </w:instrText>
+      </w:r>
+      <w:r>
+        <w:rPr>
+          <w:iCs/>
+        </w:rPr>
+      </w:r>
+      <w:r>
+        <w:rPr>
+          <w:iCs/>
+        </w:rPr>
         <w:fldChar w:fldCharType="separate"/>
       </w:r>
       <w:r>
@@ -8172,1121 +8350,164 @@
         <w:rPr>
           <w:noProof/>
         </w:rPr>
-        <w:t>7</w:t>
-      </w:r>
-      <w:r>
+        <w:t>1</w:t>
+      </w:r>
+      <w:r>
+        <w:rPr>
+          <w:iCs/>
+        </w:rPr>
         <w:fldChar w:fldCharType="end"/>
       </w:r>
       <w:r>
-        <w:t xml:space="preserve"> in </w:t>
-      </w:r>
-      <w:proofErr w:type="spellStart"/>
-      <w:r>
-        <w:t>LTspice</w:t>
-      </w:r>
-      <w:proofErr w:type="spellEnd"/>
-      <w:r>
-        <w:t>.</w:t>
+        <w:rPr>
+          <w:iCs/>
+        </w:rPr>
+        <w:t xml:space="preserve">.  After you setup the simulation, use the cursors to measure the simulation values asked for in the Simulation column of </w:t>
       </w:r>
     </w:p>
     <w:p>
       <w:pPr>
-        <w:keepNext/>
         <w:spacing w:before="100" w:beforeAutospacing="1" w:after="100" w:afterAutospacing="1" w:line="240" w:lineRule="auto"/>
         <w:ind w:left="0" w:firstLine="0"/>
-        <w:jc w:val="right"/>
-      </w:pPr>
+      </w:pPr>
+      <w:r>
+        <w:fldChar w:fldCharType="begin"/>
+      </w:r>
+      <w:r>
+        <w:instrText xml:space="preserve"> REF _Ref183891900 \h </w:instrText>
+      </w:r>
+      <w:r>
+        <w:fldChar w:fldCharType="separate"/>
+      </w:r>
+      <w:r>
+        <w:t xml:space="preserve">Table </w:t>
+      </w:r>
       <w:r>
         <w:rPr>
           <w:noProof/>
         </w:rPr>
-        <w:lastRenderedPageBreak/>
-        <w:drawing>
-          <wp:inline distT="0" distB="0" distL="0" distR="0" wp14:anchorId="70CB4550" wp14:editId="13283B00">
-            <wp:extent cx="4670423" cy="2743200"/>
-            <wp:effectExtent l="0" t="0" r="0" b="0"/>
-            <wp:docPr id="142003587" name="Picture 1"/>
-            <wp:cNvGraphicFramePr>
-              <a:graphicFrameLocks xmlns:a="http://schemas.openxmlformats.org/drawingml/2006/main" noChangeAspect="1"/>
-            </wp:cNvGraphicFramePr>
-            <a:graphic xmlns:a="http://schemas.openxmlformats.org/drawingml/2006/main">
-              <a:graphicData uri="http://schemas.openxmlformats.org/drawingml/2006/picture">
-                <pic:pic xmlns:pic="http://schemas.openxmlformats.org/drawingml/2006/picture">
-                  <pic:nvPicPr>
-                    <pic:cNvPr id="142003587" name=""/>
-                    <pic:cNvPicPr/>
-                  </pic:nvPicPr>
-                  <pic:blipFill>
-                    <a:blip r:embed="rId15"/>
-                    <a:stretch>
-                      <a:fillRect/>
-                    </a:stretch>
-                  </pic:blipFill>
-                  <pic:spPr>
-                    <a:xfrm>
-                      <a:off x="0" y="0"/>
-                      <a:ext cx="4670423" cy="2743200"/>
-                    </a:xfrm>
-                    <a:prstGeom prst="rect">
-                      <a:avLst/>
-                    </a:prstGeom>
-                  </pic:spPr>
-                </pic:pic>
-              </a:graphicData>
-            </a:graphic>
-          </wp:inline>
-        </w:drawing>
+        <w:t>4</w:t>
+      </w:r>
+      <w:r>
+        <w:fldChar w:fldCharType="end"/>
+      </w:r>
+      <w:r>
+        <w:t>.</w:t>
       </w:r>
     </w:p>
     <w:p>
       <w:pPr>
-        <w:pStyle w:val="Caption"/>
-        <w:rPr>
-          <w:b/>
-          <w:bCs/>
-        </w:rPr>
-      </w:pPr>
-      <w:bookmarkStart w:id="19" w:name="_Ref93329208"/>
-      <w:r>
-        <w:t xml:space="preserve">Figure </w:t>
-      </w:r>
-      <w:fldSimple w:instr=" SEQ Figure \* ARABIC ">
-        <w:r>
-          <w:rPr>
-            <w:noProof/>
-          </w:rPr>
-          <w:t>7</w:t>
-        </w:r>
-      </w:fldSimple>
-      <w:bookmarkEnd w:id="19"/>
-      <w:r>
-        <w:t>: 555</w:t>
-      </w:r>
-      <w:r>
-        <w:t xml:space="preserve"> Timer</w:t>
-      </w:r>
-      <w:r>
-        <w:t xml:space="preserve"> circuit </w:t>
-      </w:r>
-      <w:r>
-        <w:t>to</w:t>
-      </w:r>
-      <w:r>
-        <w:t xml:space="preserve"> construct in </w:t>
-      </w:r>
-      <w:proofErr w:type="spellStart"/>
-      <w:r>
-        <w:t>LTspice</w:t>
-      </w:r>
-      <w:proofErr w:type="spellEnd"/>
-      <w:r>
-        <w:t>.</w:t>
+        <w:pStyle w:val="Heading1"/>
+      </w:pPr>
+      <w:r>
+        <w:t>Empirical</w:t>
+      </w:r>
+      <w:r>
+        <w:t>:</w:t>
+      </w:r>
+      <w:r>
+        <w:t xml:space="preserve"> 555 Timer </w:t>
       </w:r>
     </w:p>
     <w:p>
-      <w:pPr>
-        <w:spacing w:before="100" w:beforeAutospacing="1" w:after="0" w:line="240" w:lineRule="auto"/>
-        <w:ind w:left="0" w:firstLine="0"/>
-      </w:pPr>
-      <w:r>
-        <w:t xml:space="preserve">You </w:t>
-      </w:r>
-      <w:r>
-        <w:t xml:space="preserve">will find the components </w:t>
-      </w:r>
-      <w:r>
-        <w:t xml:space="preserve">to build the </w:t>
-      </w:r>
-      <w:proofErr w:type="spellStart"/>
-      <w:r>
-        <w:t>LTspice</w:t>
-      </w:r>
-      <w:proofErr w:type="spellEnd"/>
-      <w:r>
-        <w:t xml:space="preserve"> simulation </w:t>
-      </w:r>
-      <w:r>
-        <w:t xml:space="preserve">using the information listed in the table below.  </w:t>
-      </w:r>
-    </w:p>
-    <w:tbl>
-      <w:tblPr>
-        <w:tblStyle w:val="TableGrid"/>
-        <w:tblW w:w="0" w:type="auto"/>
-        <w:tblLook w:val="04A0" w:firstRow="1" w:lastRow="0" w:firstColumn="1" w:lastColumn="0" w:noHBand="0" w:noVBand="1"/>
-      </w:tblPr>
-      <w:tblGrid>
-        <w:gridCol w:w="2515"/>
-        <w:gridCol w:w="6839"/>
-      </w:tblGrid>
-      <w:tr>
-        <w:tc>
-          <w:tcPr>
-            <w:tcW w:w="2515" w:type="dxa"/>
-          </w:tcPr>
-          <w:p>
-            <w:pPr>
-              <w:spacing w:before="100" w:beforeAutospacing="1" w:after="0" w:line="240" w:lineRule="auto"/>
-              <w:ind w:left="0" w:firstLine="0"/>
-            </w:pPr>
-            <w:r>
-              <w:t>Labeled Signals</w:t>
-            </w:r>
-          </w:p>
-        </w:tc>
-        <w:tc>
-          <w:tcPr>
-            <w:tcW w:w="6839" w:type="dxa"/>
-          </w:tcPr>
-          <w:p>
-            <w:pPr>
-              <w:spacing w:before="100" w:beforeAutospacing="1" w:after="0" w:line="240" w:lineRule="auto"/>
-              <w:ind w:left="0" w:firstLine="0"/>
-            </w:pPr>
-            <w:r>
-              <w:t xml:space="preserve">TRIG, OUT, RST, THRS and </w:t>
-            </w:r>
-            <w:proofErr w:type="spellStart"/>
-            <w:r>
-              <w:t>Vcc</w:t>
-            </w:r>
-            <w:proofErr w:type="spellEnd"/>
-          </w:p>
-        </w:tc>
-      </w:tr>
-      <w:tr>
-        <w:tc>
-          <w:tcPr>
-            <w:tcW w:w="2515" w:type="dxa"/>
-          </w:tcPr>
-          <w:p>
-            <w:pPr>
-              <w:spacing w:before="100" w:beforeAutospacing="1" w:after="0" w:line="240" w:lineRule="auto"/>
-              <w:ind w:left="0" w:firstLine="0"/>
-            </w:pPr>
-            <w:r>
-              <w:t>Configure Analysis</w:t>
-            </w:r>
-          </w:p>
-        </w:tc>
-        <w:tc>
-          <w:tcPr>
-            <w:tcW w:w="6839" w:type="dxa"/>
-          </w:tcPr>
-          <w:p>
-            <w:pPr>
-              <w:spacing w:before="100" w:beforeAutospacing="1" w:after="0" w:line="240" w:lineRule="auto"/>
-              <w:ind w:left="0" w:firstLine="0"/>
-            </w:pPr>
-            <w:r>
-              <w:t>Transient, Stop Time 5ms</w:t>
-            </w:r>
-          </w:p>
-        </w:tc>
-      </w:tr>
-      <w:tr>
-        <w:tc>
-          <w:tcPr>
-            <w:tcW w:w="2515" w:type="dxa"/>
-          </w:tcPr>
-          <w:p>
-            <w:pPr>
-              <w:spacing w:before="100" w:beforeAutospacing="1" w:after="0" w:line="240" w:lineRule="auto"/>
-              <w:ind w:left="0" w:firstLine="0"/>
-            </w:pPr>
-            <w:r>
-              <w:t>Special Components</w:t>
-            </w:r>
-          </w:p>
-        </w:tc>
-        <w:tc>
-          <w:tcPr>
-            <w:tcW w:w="6839" w:type="dxa"/>
-          </w:tcPr>
-          <w:p>
-            <w:pPr>
-              <w:spacing w:before="100" w:beforeAutospacing="1" w:after="0" w:line="240" w:lineRule="auto"/>
-              <w:ind w:left="0" w:firstLine="0"/>
-            </w:pPr>
-            <w:r>
-              <w:t>NE555</w:t>
-            </w:r>
-          </w:p>
-        </w:tc>
-      </w:tr>
-    </w:tbl>
-    <w:p>
-      <w:pPr>
-        <w:pStyle w:val="ListParagraph"/>
-        <w:numPr>
-          <w:ilvl w:val="0"/>
-          <w:numId w:val="24"/>
-        </w:numPr>
-        <w:spacing w:before="100" w:beforeAutospacing="1" w:after="100" w:afterAutospacing="1" w:line="240" w:lineRule="auto"/>
-      </w:pPr>
-      <w:r>
-        <w:t>M</w:t>
-      </w:r>
-      <w:r>
-        <w:t>ake sure to give the resistors</w:t>
-      </w:r>
-      <w:r>
-        <w:t xml:space="preserve">, </w:t>
-      </w:r>
-      <w:r>
-        <w:t>capacitors</w:t>
-      </w:r>
-      <w:r>
-        <w:t xml:space="preserve"> and voltage supply</w:t>
-      </w:r>
-      <w:r>
-        <w:t xml:space="preserve"> the correct values.</w:t>
+      <w:bookmarkStart w:id="19" w:name="_Hlk93766600"/>
+      <w:r>
+        <w:t>This week, you</w:t>
+      </w:r>
+      <w:r>
+        <w:t xml:space="preserve"> will be soldering </w:t>
+      </w:r>
+      <w:r>
+        <w:t xml:space="preserve">in the components associated with </w:t>
+      </w:r>
+      <w:r>
+        <w:t xml:space="preserve">the </w:t>
+      </w:r>
+      <w:r>
+        <w:t>POWER INPUT, 5</w:t>
+      </w:r>
+      <w:r>
+        <w:t>55</w:t>
+      </w:r>
+      <w:r>
+        <w:t xml:space="preserve"> TIMER </w:t>
+      </w:r>
+      <w:r>
+        <w:t>subsystems</w:t>
+      </w:r>
+      <w:r>
+        <w:t xml:space="preserve"> shown in the </w:t>
+      </w:r>
+      <w:r>
+        <w:rPr>
+          <w:b/>
+        </w:rPr>
+        <w:fldChar w:fldCharType="begin"/>
+      </w:r>
+      <w:r>
+        <w:instrText xml:space="preserve"> REF _Ref81486189 \h  \* MERGEFORMAT </w:instrText>
+      </w:r>
+      <w:r>
+        <w:rPr>
+          <w:b/>
+        </w:rPr>
+      </w:r>
+      <w:r>
+        <w:rPr>
+          <w:b/>
+        </w:rPr>
+        <w:fldChar w:fldCharType="separate"/>
+      </w:r>
+      <w:r>
+        <w:t xml:space="preserve">Figure </w:t>
+      </w:r>
+      <w:r>
+        <w:rPr>
+          <w:noProof/>
+        </w:rPr>
+        <w:t>7</w:t>
+      </w:r>
+      <w:r>
+        <w:rPr>
+          <w:b/>
+        </w:rPr>
+        <w:fldChar w:fldCharType="end"/>
+      </w:r>
+      <w:r>
+        <w:rPr>
+          <w:b/>
+        </w:rPr>
+        <w:t xml:space="preserve"> </w:t>
+      </w:r>
+      <w:r>
+        <w:t>schematic.</w:t>
+      </w:r>
+      <w:r>
+        <w:t xml:space="preserve"> </w:t>
+      </w:r>
+      <w:r>
+        <w:t xml:space="preserve">It is important you </w:t>
+      </w:r>
+      <w:r>
+        <w:t>do not</w:t>
+      </w:r>
+      <w:r>
+        <w:t xml:space="preserve"> </w:t>
+      </w:r>
+      <w:proofErr w:type="gramStart"/>
+      <w:r>
+        <w:t>solder</w:t>
+      </w:r>
+      <w:proofErr w:type="gramEnd"/>
+      <w:r>
+        <w:t xml:space="preserve"> in any of the other components in any of the other subsystems. </w:t>
+      </w:r>
+      <w:r>
+        <w:t xml:space="preserve"> This lab document contains cursory coverage of the assembly process. You can find much more detail in the Assembly Guide posted on Canvas.</w:t>
       </w:r>
     </w:p>
     <w:p>
       <w:pPr>
-        <w:pStyle w:val="ListParagraph"/>
-        <w:numPr>
-          <w:ilvl w:val="0"/>
-          <w:numId w:val="24"/>
-        </w:numPr>
-        <w:spacing w:before="100" w:beforeAutospacing="1" w:after="100" w:afterAutospacing="1" w:line="240" w:lineRule="auto"/>
-      </w:pPr>
-      <w:r>
-        <w:t xml:space="preserve">You can find the NE555 by </w:t>
-      </w:r>
-      <w:r>
-        <w:t>selecting the component icon at the top of the window then searching for “NE555”</w:t>
-      </w:r>
-    </w:p>
-    <w:p>
-      <w:pPr>
-        <w:pStyle w:val="ListParagraph"/>
-        <w:numPr>
-          <w:ilvl w:val="0"/>
-          <w:numId w:val="24"/>
-        </w:numPr>
-        <w:spacing w:before="100" w:beforeAutospacing="1" w:after="100" w:afterAutospacing="1" w:line="240" w:lineRule="auto"/>
-      </w:pPr>
-      <w:r>
-        <w:t xml:space="preserve">Use the components at the top of the </w:t>
-      </w:r>
-      <w:proofErr w:type="spellStart"/>
-      <w:r>
-        <w:t>LTspice</w:t>
-      </w:r>
-      <w:proofErr w:type="spellEnd"/>
-      <w:r>
-        <w:t xml:space="preserve"> window</w:t>
-      </w:r>
-      <w:r>
-        <w:t xml:space="preserve"> for resistors, capacitors, </w:t>
-      </w:r>
-      <w:proofErr w:type="gramStart"/>
-      <w:r>
-        <w:t>etc..</w:t>
-      </w:r>
-      <w:proofErr w:type="gramEnd"/>
-    </w:p>
-    <w:p>
-      <w:pPr>
-        <w:pStyle w:val="ListParagraph"/>
-        <w:numPr>
-          <w:ilvl w:val="0"/>
-          <w:numId w:val="24"/>
-        </w:numPr>
-        <w:spacing w:before="100" w:beforeAutospacing="1" w:after="100" w:afterAutospacing="1" w:line="240" w:lineRule="auto"/>
-      </w:pPr>
-      <w:r>
-        <w:t xml:space="preserve">Make sure to use the Label Net </w:t>
-      </w:r>
-      <w:proofErr w:type="gramStart"/>
-      <w:r>
-        <w:t>tool  to</w:t>
-      </w:r>
-      <w:proofErr w:type="gramEnd"/>
-      <w:r>
-        <w:t xml:space="preserve"> label the TRIG, OUT, RST, THRS and </w:t>
-      </w:r>
-      <w:proofErr w:type="spellStart"/>
-      <w:r>
-        <w:t>Vcc</w:t>
-      </w:r>
-      <w:proofErr w:type="spellEnd"/>
-      <w:r>
-        <w:t xml:space="preserve"> </w:t>
-      </w:r>
-      <w:r>
-        <w:t>nets.</w:t>
-      </w:r>
-    </w:p>
-    <w:p>
-      <w:pPr>
-        <w:pStyle w:val="ListParagraph"/>
-        <w:spacing w:before="100" w:beforeAutospacing="1" w:after="100" w:afterAutospacing="1" w:line="240" w:lineRule="auto"/>
-        <w:ind w:firstLine="0"/>
-      </w:pPr>
-    </w:p>
-    <w:p>
-      <w:pPr>
-        <w:pStyle w:val="ListParagraph"/>
-        <w:numPr>
-          <w:ilvl w:val="0"/>
-          <w:numId w:val="18"/>
-        </w:numPr>
-      </w:pPr>
-      <w:bookmarkStart w:id="20" w:name="simulation_Q2"/>
-      <w:r>
-        <w:t xml:space="preserve">Simulate </w:t>
-      </w:r>
-      <w:bookmarkEnd w:id="20"/>
-      <w:r>
-        <w:t xml:space="preserve">your </w:t>
-      </w:r>
-      <w:r>
-        <w:t>circuit</w:t>
-      </w:r>
-      <w:r>
-        <w:t xml:space="preserve"> for </w:t>
-      </w:r>
-      <w:r>
-        <w:t>5</w:t>
-      </w:r>
-      <w:r>
-        <w:t xml:space="preserve"> </w:t>
-      </w:r>
-      <w:proofErr w:type="spellStart"/>
-      <w:r>
-        <w:t>ms</w:t>
-      </w:r>
-      <w:proofErr w:type="spellEnd"/>
-      <w:r>
-        <w:t xml:space="preserve"> and while probing OUT and TRIG</w:t>
-      </w:r>
-    </w:p>
-    <w:p>
-      <w:pPr>
-        <w:pStyle w:val="ListParagraph"/>
-        <w:numPr>
-          <w:ilvl w:val="1"/>
-          <w:numId w:val="18"/>
-        </w:numPr>
-      </w:pPr>
-      <w:r>
-        <w:t>Click the green play icon at the top of the window</w:t>
-      </w:r>
-    </w:p>
-    <w:p>
-      <w:pPr>
-        <w:pStyle w:val="ListParagraph"/>
-        <w:numPr>
-          <w:ilvl w:val="1"/>
-          <w:numId w:val="18"/>
-        </w:numPr>
-      </w:pPr>
-      <w:r>
-        <w:t>In the Configure Analysis pop-up</w:t>
-      </w:r>
-    </w:p>
-    <w:p>
-      <w:pPr>
-        <w:pStyle w:val="ListParagraph"/>
-        <w:numPr>
-          <w:ilvl w:val="2"/>
-          <w:numId w:val="18"/>
-        </w:numPr>
-      </w:pPr>
-      <w:r>
-        <w:t>Select the Transient tab</w:t>
-      </w:r>
-    </w:p>
-    <w:p>
-      <w:pPr>
-        <w:pStyle w:val="ListParagraph"/>
-        <w:numPr>
-          <w:ilvl w:val="2"/>
-          <w:numId w:val="18"/>
-        </w:numPr>
-      </w:pPr>
-      <w:r>
-        <w:t>Enter “5m” in the Stop time text box</w:t>
-      </w:r>
-    </w:p>
-    <w:p>
-      <w:pPr>
-        <w:pStyle w:val="ListParagraph"/>
-        <w:numPr>
-          <w:ilvl w:val="2"/>
-          <w:numId w:val="18"/>
-        </w:numPr>
-      </w:pPr>
-      <w:r>
-        <w:t>Click OK</w:t>
-      </w:r>
-    </w:p>
-    <w:p>
-      <w:pPr>
-        <w:pStyle w:val="ListParagraph"/>
-        <w:ind w:left="2160" w:firstLine="0"/>
-      </w:pPr>
-      <w:r>
-        <w:t>You should see an empty waveform appear on the screen</w:t>
-      </w:r>
-    </w:p>
-    <w:p>
-      <w:pPr>
-        <w:pStyle w:val="ListParagraph"/>
-        <w:numPr>
-          <w:ilvl w:val="1"/>
-          <w:numId w:val="18"/>
-        </w:numPr>
-      </w:pPr>
-      <w:r>
-        <w:t>Add probes</w:t>
-      </w:r>
-      <w:r>
-        <w:t xml:space="preserve"> to your schematic</w:t>
-      </w:r>
-    </w:p>
-    <w:p>
-      <w:pPr>
-        <w:pStyle w:val="ListParagraph"/>
-        <w:numPr>
-          <w:ilvl w:val="2"/>
-          <w:numId w:val="18"/>
-        </w:numPr>
-      </w:pPr>
-      <w:r>
-        <w:t>Select the schematic window</w:t>
-      </w:r>
-    </w:p>
-    <w:p>
-      <w:pPr>
-        <w:pStyle w:val="ListParagraph"/>
-        <w:numPr>
-          <w:ilvl w:val="2"/>
-          <w:numId w:val="18"/>
-        </w:numPr>
-      </w:pPr>
-      <w:r>
-        <w:t>Move the cursor to the OUT pin – it will transform into a red probe icon</w:t>
-      </w:r>
-    </w:p>
-    <w:p>
-      <w:pPr>
-        <w:pStyle w:val="ListParagraph"/>
-        <w:numPr>
-          <w:ilvl w:val="2"/>
-          <w:numId w:val="18"/>
-        </w:numPr>
-      </w:pPr>
-      <w:r>
-        <w:t xml:space="preserve">While the cursor looks like a probe icon </w:t>
-      </w:r>
-      <w:r>
-        <w:t>left mouse click</w:t>
-      </w:r>
-    </w:p>
-    <w:p>
-      <w:pPr>
-        <w:pStyle w:val="ListParagraph"/>
-        <w:ind w:left="2160" w:firstLine="0"/>
-      </w:pPr>
-      <w:r>
-        <w:t>You should see the OUT wave appear in the waveform window</w:t>
-      </w:r>
-    </w:p>
-    <w:p>
-      <w:pPr>
-        <w:pStyle w:val="ListParagraph"/>
-        <w:numPr>
-          <w:ilvl w:val="2"/>
-          <w:numId w:val="18"/>
-        </w:numPr>
-      </w:pPr>
-      <w:r>
-        <w:t>Add a probe to the TRIG net</w:t>
-      </w:r>
-    </w:p>
-    <w:p>
-      <w:pPr>
-        <w:pStyle w:val="ListParagraph"/>
-        <w:numPr>
-          <w:ilvl w:val="0"/>
-          <w:numId w:val="18"/>
-        </w:numPr>
-      </w:pPr>
-      <w:r>
-        <w:t>Capture the schematic and waveforms for your report</w:t>
-      </w:r>
-    </w:p>
-    <w:p>
-      <w:pPr>
-        <w:pStyle w:val="ListParagraph"/>
-        <w:numPr>
-          <w:ilvl w:val="1"/>
-          <w:numId w:val="18"/>
-        </w:numPr>
-      </w:pPr>
-      <w:r>
-        <w:t>Select the schematic</w:t>
-      </w:r>
-    </w:p>
-    <w:p>
-      <w:pPr>
-        <w:pStyle w:val="ListParagraph"/>
-        <w:numPr>
-          <w:ilvl w:val="1"/>
-          <w:numId w:val="18"/>
-        </w:numPr>
-      </w:pPr>
-      <w:r>
-        <w:t>Click on the Zoom to Fit icon at the top of the window</w:t>
-      </w:r>
-    </w:p>
-    <w:p>
-      <w:pPr>
-        <w:pStyle w:val="ListParagraph"/>
-        <w:numPr>
-          <w:ilvl w:val="1"/>
-          <w:numId w:val="18"/>
-        </w:numPr>
-      </w:pPr>
-      <w:r>
-        <w:t>Tools -&gt; Copy bitmap to Clipboard</w:t>
-      </w:r>
-    </w:p>
-    <w:p>
-      <w:pPr>
-        <w:pStyle w:val="ListParagraph"/>
-        <w:numPr>
-          <w:ilvl w:val="1"/>
-          <w:numId w:val="18"/>
-        </w:numPr>
-      </w:pPr>
-      <w:r>
-        <w:lastRenderedPageBreak/>
-        <w:t>Do the same for the</w:t>
-      </w:r>
-      <w:r>
-        <w:t xml:space="preserve"> TRIG</w:t>
-      </w:r>
-      <w:r>
-        <w:t xml:space="preserve"> waveform</w:t>
-      </w:r>
-    </w:p>
-    <w:p>
-      <w:pPr>
-        <w:pStyle w:val="ListParagraph"/>
-        <w:numPr>
-          <w:ilvl w:val="0"/>
-          <w:numId w:val="18"/>
-        </w:numPr>
-        <w:spacing w:before="100" w:beforeAutospacing="1" w:after="100" w:afterAutospacing="1" w:line="240" w:lineRule="auto"/>
-        <w:rPr>
-          <w:vanish/>
-        </w:rPr>
-      </w:pPr>
-      <w:bookmarkStart w:id="21" w:name="simulation_Q3"/>
-      <w:r>
-        <w:t xml:space="preserve">Use </w:t>
-      </w:r>
-      <w:bookmarkEnd w:id="21"/>
-      <w:r>
-        <w:t xml:space="preserve">the timing diagram to measure the </w:t>
-      </w:r>
-      <w:r>
-        <w:t>t</w:t>
-      </w:r>
-      <w:r>
-        <w:t>ime high, time low, period, frequency</w:t>
-      </w:r>
-      <w:r>
-        <w:t>,</w:t>
-      </w:r>
-      <w:r>
-        <w:t xml:space="preserve"> and duty cycle of the waveform on the OUT pin.</w:t>
-      </w:r>
-    </w:p>
-    <w:p>
-      <w:pPr>
-        <w:spacing w:before="100" w:beforeAutospacing="1" w:after="100" w:afterAutospacing="1" w:line="240" w:lineRule="auto"/>
-        <w:ind w:left="0" w:firstLine="0"/>
-      </w:pPr>
-    </w:p>
-    <w:p>
-      <w:pPr>
-        <w:pStyle w:val="ListParagraph"/>
-        <w:numPr>
-          <w:ilvl w:val="1"/>
-          <w:numId w:val="18"/>
-        </w:numPr>
-        <w:spacing w:before="100" w:beforeAutospacing="1" w:after="100" w:afterAutospacing="1" w:line="240" w:lineRule="auto"/>
-      </w:pPr>
-      <w:r>
-        <w:t>Select the waveform window</w:t>
-      </w:r>
-    </w:p>
-    <w:p>
-      <w:pPr>
-        <w:pStyle w:val="ListParagraph"/>
-        <w:numPr>
-          <w:ilvl w:val="1"/>
-          <w:numId w:val="18"/>
-        </w:numPr>
-        <w:spacing w:before="100" w:beforeAutospacing="1" w:after="100" w:afterAutospacing="1" w:line="240" w:lineRule="auto"/>
-      </w:pPr>
-      <w:r>
-        <w:t xml:space="preserve">Left click on </w:t>
-      </w:r>
-      <w:r>
-        <w:t>“V(out)” at the top of the waveform window</w:t>
-      </w:r>
-    </w:p>
-    <w:p>
-      <w:pPr>
-        <w:pStyle w:val="ListParagraph"/>
-        <w:spacing w:before="100" w:beforeAutospacing="1" w:after="100" w:afterAutospacing="1" w:line="240" w:lineRule="auto"/>
-        <w:ind w:left="1440" w:firstLine="0"/>
-      </w:pPr>
-      <w:r>
-        <w:t>You should see white cursors appear in the waveform window along with a pop-up containing numerical data.</w:t>
-      </w:r>
-    </w:p>
-    <w:p>
-      <w:pPr>
-        <w:pStyle w:val="ListParagraph"/>
-        <w:numPr>
-          <w:ilvl w:val="1"/>
-          <w:numId w:val="18"/>
-        </w:numPr>
-        <w:spacing w:before="100" w:beforeAutospacing="1" w:after="100" w:afterAutospacing="1" w:line="240" w:lineRule="auto"/>
-      </w:pPr>
-      <w:r>
-        <w:t>Move the vertical cursor to the positive edge of the OUT wave</w:t>
-      </w:r>
-    </w:p>
-    <w:p>
-      <w:pPr>
-        <w:pStyle w:val="ListParagraph"/>
-        <w:numPr>
-          <w:ilvl w:val="1"/>
-          <w:numId w:val="18"/>
-        </w:numPr>
-        <w:spacing w:before="100" w:beforeAutospacing="1" w:after="100" w:afterAutospacing="1" w:line="240" w:lineRule="auto"/>
-      </w:pPr>
-      <w:r>
-        <w:t xml:space="preserve">Right </w:t>
-      </w:r>
-      <w:proofErr w:type="gramStart"/>
-      <w:r>
-        <w:t>mouse</w:t>
-      </w:r>
-      <w:proofErr w:type="gramEnd"/>
-      <w:r>
-        <w:t xml:space="preserve"> click in the waveform window and select Place Cursor on Active Trace.</w:t>
-      </w:r>
-    </w:p>
-    <w:p>
-      <w:pPr>
-        <w:pStyle w:val="ListParagraph"/>
-        <w:spacing w:before="100" w:beforeAutospacing="1" w:after="100" w:afterAutospacing="1" w:line="240" w:lineRule="auto"/>
-        <w:ind w:left="1440" w:firstLine="0"/>
-      </w:pPr>
-      <w:r>
-        <w:t>A second white cursor should appear along with additional data in the pop-up</w:t>
-      </w:r>
-    </w:p>
-    <w:p>
-      <w:pPr>
-        <w:pStyle w:val="ListParagraph"/>
-        <w:numPr>
-          <w:ilvl w:val="1"/>
-          <w:numId w:val="18"/>
-        </w:numPr>
-        <w:spacing w:before="100" w:beforeAutospacing="1" w:after="100" w:afterAutospacing="1" w:line="240" w:lineRule="auto"/>
-      </w:pPr>
-      <w:r>
-        <w:t>Position the second cursor on the negative edge just after the cursor you just placed</w:t>
-      </w:r>
-    </w:p>
-    <w:p>
-      <w:pPr>
-        <w:pStyle w:val="ListParagraph"/>
-        <w:numPr>
-          <w:ilvl w:val="1"/>
-          <w:numId w:val="18"/>
-        </w:numPr>
-        <w:spacing w:before="100" w:beforeAutospacing="1" w:after="100" w:afterAutospacing="1" w:line="240" w:lineRule="auto"/>
-      </w:pPr>
-      <w:r>
-        <w:t xml:space="preserve">Record the values into the time high of the waveform into </w:t>
-      </w:r>
-      <w:r>
-        <w:fldChar w:fldCharType="begin"/>
-      </w:r>
-      <w:r>
-        <w:instrText xml:space="preserve"> REF _Ref183891900 \h </w:instrText>
-      </w:r>
-      <w:r>
-        <w:fldChar w:fldCharType="separate"/>
-      </w:r>
-      <w:r>
-        <w:t xml:space="preserve">Table </w:t>
-      </w:r>
-      <w:r>
-        <w:rPr>
-          <w:noProof/>
-        </w:rPr>
-        <w:t>4</w:t>
-      </w:r>
-      <w:r>
-        <w:fldChar w:fldCharType="end"/>
-      </w:r>
-      <w:r>
-        <w:t>.</w:t>
-      </w:r>
-    </w:p>
-    <w:p>
-      <w:pPr>
-        <w:pStyle w:val="ListParagraph"/>
-        <w:numPr>
-          <w:ilvl w:val="1"/>
-          <w:numId w:val="18"/>
-        </w:numPr>
-        <w:spacing w:before="100" w:beforeAutospacing="1" w:after="100" w:afterAutospacing="1" w:line="240" w:lineRule="auto"/>
-      </w:pPr>
-      <w:r>
-        <w:t xml:space="preserve">Manipulate the cursor to get the other values in </w:t>
-      </w:r>
-      <w:r>
-        <w:fldChar w:fldCharType="begin"/>
-      </w:r>
-      <w:r>
-        <w:instrText xml:space="preserve"> REF _Ref183891900 \h </w:instrText>
-      </w:r>
-      <w:r>
-        <w:fldChar w:fldCharType="separate"/>
-      </w:r>
-      <w:r>
-        <w:t xml:space="preserve">Table </w:t>
-      </w:r>
-      <w:r>
-        <w:rPr>
-          <w:noProof/>
-        </w:rPr>
-        <w:t>4</w:t>
-      </w:r>
-      <w:r>
-        <w:fldChar w:fldCharType="end"/>
-      </w:r>
-      <w:r>
-        <w:t>.</w:t>
-      </w:r>
-    </w:p>
-    <w:p>
-      <w:pPr>
-        <w:pStyle w:val="ListParagraph"/>
-        <w:numPr>
-          <w:ilvl w:val="0"/>
-          <w:numId w:val="18"/>
-        </w:numPr>
-        <w:spacing w:before="100" w:beforeAutospacing="1" w:after="100" w:afterAutospacing="1" w:line="240" w:lineRule="auto"/>
-        <w:rPr>
-          <w:b/>
-          <w:bCs/>
-        </w:rPr>
-      </w:pPr>
-      <w:bookmarkStart w:id="22" w:name="simulation_Q4"/>
-      <w:r>
-        <w:t>U</w:t>
-      </w:r>
-      <w:r>
-        <w:t>se</w:t>
-      </w:r>
-      <w:r>
-        <w:t xml:space="preserve"> </w:t>
-      </w:r>
-      <w:bookmarkEnd w:id="22"/>
-      <w:r>
-        <w:t xml:space="preserve">the timing diagram to measure the </w:t>
-      </w:r>
-      <w:r>
-        <w:t>high and low voltages of the TRI</w:t>
-      </w:r>
-      <w:r>
-        <w:t>G</w:t>
-      </w:r>
-      <w:r>
-        <w:t xml:space="preserve"> pin.</w:t>
-      </w:r>
-      <w:r>
-        <w:t xml:space="preserve"> </w:t>
-      </w:r>
-    </w:p>
-    <w:p>
-      <w:pPr>
-        <w:pStyle w:val="ListParagraph"/>
-        <w:numPr>
-          <w:ilvl w:val="1"/>
-          <w:numId w:val="18"/>
-        </w:numPr>
-        <w:spacing w:before="100" w:beforeAutospacing="1" w:after="100" w:afterAutospacing="1" w:line="240" w:lineRule="auto"/>
-        <w:rPr>
-          <w:b/>
-          <w:bCs/>
-        </w:rPr>
-      </w:pPr>
-      <w:r>
-        <w:t>Remove the V(out) cursors by right clicking in the waveform window and selecting Clear All Cursors</w:t>
-      </w:r>
-    </w:p>
-    <w:p>
-      <w:pPr>
-        <w:pStyle w:val="ListParagraph"/>
-        <w:numPr>
-          <w:ilvl w:val="1"/>
-          <w:numId w:val="18"/>
-        </w:numPr>
-        <w:spacing w:before="100" w:beforeAutospacing="1" w:after="100" w:afterAutospacing="1" w:line="240" w:lineRule="auto"/>
-        <w:rPr>
-          <w:b/>
-          <w:bCs/>
-        </w:rPr>
-      </w:pPr>
-      <w:r>
-        <w:t>Click on V(</w:t>
-      </w:r>
-      <w:proofErr w:type="gramStart"/>
-      <w:r>
-        <w:t>trig</w:t>
-      </w:r>
-      <w:proofErr w:type="gramEnd"/>
-      <w:r>
-        <w:t>) at the top of the waveform window.</w:t>
-      </w:r>
-    </w:p>
-    <w:p>
-      <w:pPr>
-        <w:pStyle w:val="ListParagraph"/>
-        <w:numPr>
-          <w:ilvl w:val="1"/>
-          <w:numId w:val="18"/>
-        </w:numPr>
-        <w:spacing w:before="100" w:beforeAutospacing="1" w:after="100" w:afterAutospacing="1" w:line="240" w:lineRule="auto"/>
-        <w:rPr>
-          <w:b/>
-          <w:bCs/>
-        </w:rPr>
-      </w:pPr>
-      <w:r>
-        <w:t xml:space="preserve">Repeat cursor steps </w:t>
-      </w:r>
-      <w:proofErr w:type="gramStart"/>
-      <w:r>
-        <w:t>used</w:t>
-      </w:r>
-      <w:proofErr w:type="gramEnd"/>
-      <w:r>
-        <w:t xml:space="preserve"> to measure OUT waveform and record your values in </w:t>
-      </w:r>
-      <w:r>
-        <w:fldChar w:fldCharType="begin"/>
-      </w:r>
-      <w:r>
-        <w:instrText xml:space="preserve"> REF _Ref183891900 \h </w:instrText>
-      </w:r>
-      <w:r>
-        <w:fldChar w:fldCharType="separate"/>
-      </w:r>
-      <w:r>
-        <w:t xml:space="preserve">Table </w:t>
-      </w:r>
-      <w:r>
-        <w:rPr>
-          <w:noProof/>
-        </w:rPr>
-        <w:t>4</w:t>
-      </w:r>
-      <w:r>
-        <w:fldChar w:fldCharType="end"/>
-      </w:r>
-      <w:r>
-        <w:t>.</w:t>
-      </w:r>
-      <w:r>
-        <w:rPr>
-          <w:b/>
-          <w:bCs/>
-          <w:vanish/>
-        </w:rPr>
-        <w:t>High = 6.</w:t>
-      </w:r>
-      <w:r>
-        <w:rPr>
-          <w:b/>
-          <w:bCs/>
-          <w:vanish/>
-        </w:rPr>
-        <w:t>0</w:t>
-      </w:r>
-      <w:r>
-        <w:rPr>
-          <w:b/>
-          <w:bCs/>
-          <w:vanish/>
-        </w:rPr>
-        <w:t>V</w:t>
-      </w:r>
-      <w:r>
-        <w:rPr>
-          <w:b/>
-          <w:bCs/>
-          <w:vanish/>
-        </w:rPr>
-        <w:tab/>
-      </w:r>
-      <w:r>
-        <w:rPr>
-          <w:b/>
-          <w:bCs/>
-          <w:vanish/>
-        </w:rPr>
-        <w:tab/>
-      </w:r>
-      <w:r>
-        <w:rPr>
-          <w:b/>
-          <w:bCs/>
-          <w:vanish/>
-        </w:rPr>
-        <w:t>Low = 3.0V</w:t>
-      </w:r>
-    </w:p>
-    <w:p>
-      <w:pPr>
-        <w:spacing w:after="160" w:line="259" w:lineRule="auto"/>
-        <w:ind w:left="0" w:firstLine="0"/>
-        <w:rPr>
-          <w:b/>
-          <w:sz w:val="36"/>
-          <w:szCs w:val="36"/>
-        </w:rPr>
-      </w:pPr>
-    </w:p>
-    <w:p>
-      <w:pPr>
-        <w:pStyle w:val="Heading1"/>
-      </w:pPr>
-      <w:r>
-        <w:t>Empirical</w:t>
-      </w:r>
-      <w:r>
-        <w:t>:</w:t>
-      </w:r>
-      <w:r>
-        <w:t xml:space="preserve"> 555 Timer </w:t>
-      </w:r>
-    </w:p>
-    <w:p>
-      <w:bookmarkStart w:id="23" w:name="_Hlk93766600"/>
-      <w:r>
-        <w:t>This week, you</w:t>
-      </w:r>
-      <w:r>
-        <w:t xml:space="preserve"> will be soldering </w:t>
-      </w:r>
-      <w:r>
-        <w:t xml:space="preserve">in the components associated with </w:t>
-      </w:r>
-      <w:r>
-        <w:t xml:space="preserve">the </w:t>
-      </w:r>
-      <w:r>
-        <w:t>POWER INPUT, 5</w:t>
-      </w:r>
-      <w:r>
-        <w:t>55</w:t>
-      </w:r>
-      <w:r>
-        <w:t xml:space="preserve"> TIMER </w:t>
-      </w:r>
-      <w:r>
-        <w:t>subsystems</w:t>
-      </w:r>
-      <w:r>
-        <w:t xml:space="preserve"> shown in the </w:t>
-      </w:r>
-      <w:r>
-        <w:rPr>
-          <w:b/>
-        </w:rPr>
-        <w:fldChar w:fldCharType="begin"/>
-      </w:r>
-      <w:r>
-        <w:instrText xml:space="preserve"> REF _Ref81486189 \h  \* MERGEFORMAT </w:instrText>
-      </w:r>
-      <w:r>
-        <w:rPr>
-          <w:b/>
-        </w:rPr>
-      </w:r>
-      <w:r>
-        <w:rPr>
-          <w:b/>
-        </w:rPr>
-        <w:fldChar w:fldCharType="separate"/>
-      </w:r>
-      <w:r>
-        <w:t xml:space="preserve">Figure </w:t>
-      </w:r>
-      <w:r>
-        <w:rPr>
-          <w:noProof/>
-        </w:rPr>
-        <w:t>8</w:t>
-      </w:r>
-      <w:r>
-        <w:rPr>
-          <w:b/>
-        </w:rPr>
-        <w:fldChar w:fldCharType="end"/>
-      </w:r>
-      <w:r>
-        <w:rPr>
-          <w:b/>
-        </w:rPr>
-        <w:t xml:space="preserve"> </w:t>
-      </w:r>
-      <w:r>
-        <w:t>schematic.</w:t>
-      </w:r>
-      <w:r>
-        <w:t xml:space="preserve"> </w:t>
-      </w:r>
-      <w:r>
-        <w:t xml:space="preserve">It is important you </w:t>
-      </w:r>
-      <w:r>
-        <w:t>do not</w:t>
-      </w:r>
-      <w:r>
-        <w:t xml:space="preserve"> </w:t>
-      </w:r>
-      <w:proofErr w:type="gramStart"/>
-      <w:r>
-        <w:t>solder</w:t>
-      </w:r>
-      <w:proofErr w:type="gramEnd"/>
-      <w:r>
-        <w:t xml:space="preserve"> in any of the other components in any of the other subsystems. </w:t>
-      </w:r>
-      <w:r>
-        <w:t xml:space="preserve"> This lab document contains cursory coverage of the assembly process. You can find much more detail in the Assembly Guide posted on Canvas.</w:t>
-      </w:r>
-    </w:p>
-    <w:p>
-      <w:pPr>
         <w:keepNext/>
         <w:ind w:left="0" w:firstLine="0"/>
       </w:pPr>
@@ -9294,9 +8515,8 @@
         <w:rPr>
           <w:noProof/>
         </w:rPr>
-        <w:lastRenderedPageBreak/>
         <w:drawing>
-          <wp:inline distT="0" distB="0" distL="0" distR="0" wp14:anchorId="1E6A453F" wp14:editId="5328E78C">
+          <wp:inline distT="0" distB="0" distL="0" distR="0" wp14:anchorId="1E6A453F" wp14:editId="0D8B8C98">
             <wp:extent cx="5400000" cy="4178894"/>
             <wp:effectExtent l="0" t="0" r="0" b="0"/>
             <wp:docPr id="50502654" name="Picture 1"/>
@@ -9313,7 +8533,7 @@
                     </pic:cNvPicPr>
                   </pic:nvPicPr>
                   <pic:blipFill>
-                    <a:blip r:embed="rId16" cstate="print">
+                    <a:blip r:embed="rId15" cstate="print">
                       <a:extLst>
                         <a:ext uri="{28A0092B-C50C-407E-A947-70E740481C1C}">
                           <a14:useLocalDpi xmlns:a14="http://schemas.microsoft.com/office/drawing/2010/main" val="0"/>
@@ -9349,7 +8569,7 @@
       <w:pPr>
         <w:pStyle w:val="Caption"/>
       </w:pPr>
-      <w:bookmarkStart w:id="24" w:name="_Ref81486189"/>
+      <w:bookmarkStart w:id="20" w:name="_Ref81486189"/>
       <w:r>
         <w:t xml:space="preserve">Figure </w:t>
       </w:r>
@@ -9358,15 +8578,15 @@
           <w:rPr>
             <w:noProof/>
           </w:rPr>
-          <w:t>8</w:t>
+          <w:t>7</w:t>
         </w:r>
       </w:fldSimple>
-      <w:bookmarkEnd w:id="24"/>
+      <w:bookmarkEnd w:id="20"/>
       <w:r>
         <w:t xml:space="preserve">: The schematic for the BJT curve tracer. </w:t>
       </w:r>
     </w:p>
-    <w:bookmarkEnd w:id="23"/>
+    <w:bookmarkEnd w:id="19"/>
     <w:p>
       <w:pPr>
         <w:pStyle w:val="Heading2"/>
@@ -9412,7 +8632,7 @@
         <w:rPr>
           <w:noProof/>
         </w:rPr>
-        <w:t>8</w:t>
+        <w:t>7</w:t>
       </w:r>
       <w:r>
         <w:rPr>
@@ -9495,6 +8715,7 @@
         <w:pStyle w:val="Heading2"/>
       </w:pPr>
       <w:r>
+        <w:lastRenderedPageBreak/>
         <w:t xml:space="preserve">555 TIMER </w:t>
       </w:r>
       <w:r>
@@ -9544,7 +8765,7 @@
         <w:rPr>
           <w:noProof/>
         </w:rPr>
-        <w:t>8</w:t>
+        <w:t>7</w:t>
       </w:r>
       <w:r>
         <w:rPr>
@@ -9640,7 +8861,7 @@
         <w:rPr>
           <w:noProof/>
         </w:rPr>
-        <w:t>8</w:t>
+        <w:t>7</w:t>
       </w:r>
       <w:r>
         <w:fldChar w:fldCharType="end"/>
@@ -9738,11 +8959,7 @@
         <w:t xml:space="preserve"> </w:t>
       </w:r>
       <w:r>
-        <w:t xml:space="preserve">more </w:t>
-      </w:r>
-      <w:r>
-        <w:lastRenderedPageBreak/>
-        <w:t xml:space="preserve">information about the polarized parts you will install </w:t>
+        <w:t xml:space="preserve">more information about the polarized parts you will install </w:t>
       </w:r>
       <w:proofErr w:type="gramStart"/>
       <w:r>
@@ -9856,7 +9073,7 @@
       <w:r>
         <w:t xml:space="preserve">list of test point connections that you should solder this week.  </w:t>
       </w:r>
-      <w:bookmarkStart w:id="25" w:name="_Hlk93767319"/>
+      <w:bookmarkStart w:id="21" w:name="_Hlk93767319"/>
     </w:p>
     <w:p>
       <w:pPr>
@@ -9909,7 +9126,7 @@
         <w:rPr>
           <w:noProof/>
         </w:rPr>
-        <w:t>9</w:t>
+        <w:t>8</w:t>
       </w:r>
       <w:r>
         <w:fldChar w:fldCharType="end"/>
@@ -9946,7 +9163,7 @@
                     </pic:cNvPicPr>
                   </pic:nvPicPr>
                   <pic:blipFill>
-                    <a:blip r:embed="rId17" cstate="print">
+                    <a:blip r:embed="rId16" cstate="print">
                       <a:extLst>
                         <a:ext uri="{28A0092B-C50C-407E-A947-70E740481C1C}">
                           <a14:useLocalDpi xmlns:a14="http://schemas.microsoft.com/office/drawing/2010/main" val="0"/>
@@ -9982,7 +9199,7 @@
       <w:pPr>
         <w:pStyle w:val="Caption"/>
       </w:pPr>
-      <w:bookmarkStart w:id="26" w:name="_Ref81424711"/>
+      <w:bookmarkStart w:id="22" w:name="_Ref81424711"/>
       <w:r>
         <w:t xml:space="preserve">Figure </w:t>
       </w:r>
@@ -9991,10 +9208,10 @@
           <w:rPr>
             <w:noProof/>
           </w:rPr>
-          <w:t>9</w:t>
+          <w:t>8</w:t>
         </w:r>
       </w:fldSimple>
-      <w:bookmarkEnd w:id="26"/>
+      <w:bookmarkEnd w:id="22"/>
       <w:r>
         <w:t>: The colored bands on resistors indicate their resistance value.</w:t>
       </w:r>
@@ -10019,7 +9236,7 @@
         <w:rPr>
           <w:noProof/>
         </w:rPr>
-        <w:t>9</w:t>
+        <w:t>8</w:t>
       </w:r>
       <w:r>
         <w:fldChar w:fldCharType="end"/>
@@ -10135,7 +9352,7 @@
         <w:keepNext/>
         <w:ind w:left="0" w:firstLine="0"/>
       </w:pPr>
-      <w:bookmarkStart w:id="27" w:name="_Ref81764656"/>
+      <w:bookmarkStart w:id="23" w:name="_Ref81764656"/>
       <w:r>
         <w:lastRenderedPageBreak/>
         <w:t xml:space="preserve">Table </w:t>
@@ -10148,7 +9365,7 @@
           <w:t>2</w:t>
         </w:r>
       </w:fldSimple>
-      <w:bookmarkEnd w:id="27"/>
+      <w:bookmarkEnd w:id="23"/>
       <w:r>
         <w:t>: Complete the missing entries in the table of resistance color codes.</w:t>
       </w:r>
@@ -11700,7 +10917,7 @@
         <w:pStyle w:val="Caption"/>
         <w:keepNext/>
       </w:pPr>
-      <w:bookmarkStart w:id="28" w:name="_Ref93319897"/>
+      <w:bookmarkStart w:id="24" w:name="_Ref93319897"/>
       <w:r>
         <w:t xml:space="preserve">Table </w:t>
       </w:r>
@@ -11712,7 +10929,7 @@
           <w:t>3</w:t>
         </w:r>
       </w:fldSimple>
-      <w:bookmarkEnd w:id="28"/>
+      <w:bookmarkEnd w:id="24"/>
       <w:r>
         <w:t>: Match the schematic symbol with the corresponding part.</w:t>
       </w:r>
@@ -11854,7 +11071,7 @@
                           <pic:cNvPicPr/>
                         </pic:nvPicPr>
                         <pic:blipFill>
-                          <a:blip r:embed="rId18"/>
+                          <a:blip r:embed="rId17"/>
                           <a:stretch>
                             <a:fillRect/>
                           </a:stretch>
@@ -11939,7 +11156,7 @@
                           </pic:cNvPicPr>
                         </pic:nvPicPr>
                         <pic:blipFill>
-                          <a:blip r:embed="rId19" cstate="print">
+                          <a:blip r:embed="rId18" cstate="print">
                             <a:extLst>
                               <a:ext uri="{28A0092B-C50C-407E-A947-70E740481C1C}">
                                 <a14:useLocalDpi xmlns:a14="http://schemas.microsoft.com/office/drawing/2010/main" val="0"/>
@@ -12008,7 +11225,7 @@
                           <pic:cNvPicPr/>
                         </pic:nvPicPr>
                         <pic:blipFill>
-                          <a:blip r:embed="rId20"/>
+                          <a:blip r:embed="rId19"/>
                           <a:stretch>
                             <a:fillRect/>
                           </a:stretch>
@@ -12093,7 +11310,7 @@
                           </pic:cNvPicPr>
                         </pic:nvPicPr>
                         <pic:blipFill>
-                          <a:blip r:embed="rId21" cstate="print">
+                          <a:blip r:embed="rId20" cstate="print">
                             <a:extLst>
                               <a:ext uri="{28A0092B-C50C-407E-A947-70E740481C1C}">
                                 <a14:useLocalDpi xmlns:a14="http://schemas.microsoft.com/office/drawing/2010/main" val="0"/>
@@ -12162,7 +11379,7 @@
                           <pic:cNvPicPr/>
                         </pic:nvPicPr>
                         <pic:blipFill>
-                          <a:blip r:embed="rId22"/>
+                          <a:blip r:embed="rId21"/>
                           <a:stretch>
                             <a:fillRect/>
                           </a:stretch>
@@ -12247,7 +11464,7 @@
                           </pic:cNvPicPr>
                         </pic:nvPicPr>
                         <pic:blipFill>
-                          <a:blip r:embed="rId23" cstate="print">
+                          <a:blip r:embed="rId22" cstate="print">
                             <a:extLst>
                               <a:ext uri="{28A0092B-C50C-407E-A947-70E740481C1C}">
                                 <a14:useLocalDpi xmlns:a14="http://schemas.microsoft.com/office/drawing/2010/main" val="0"/>
@@ -12316,7 +11533,7 @@
                           <pic:cNvPicPr/>
                         </pic:nvPicPr>
                         <pic:blipFill>
-                          <a:blip r:embed="rId24"/>
+                          <a:blip r:embed="rId23"/>
                           <a:stretch>
                             <a:fillRect/>
                           </a:stretch>
@@ -12401,7 +11618,7 @@
                           </pic:cNvPicPr>
                         </pic:nvPicPr>
                         <pic:blipFill>
-                          <a:blip r:embed="rId25" cstate="print">
+                          <a:blip r:embed="rId24" cstate="print">
                             <a:extLst>
                               <a:ext uri="{28A0092B-C50C-407E-A947-70E740481C1C}">
                                 <a14:useLocalDpi xmlns:a14="http://schemas.microsoft.com/office/drawing/2010/main" val="0"/>
@@ -12470,7 +11687,7 @@
                           <pic:cNvPicPr/>
                         </pic:nvPicPr>
                         <pic:blipFill>
-                          <a:blip r:embed="rId26"/>
+                          <a:blip r:embed="rId25"/>
                           <a:stretch>
                             <a:fillRect/>
                           </a:stretch>
@@ -12555,7 +11772,7 @@
                           </pic:cNvPicPr>
                         </pic:nvPicPr>
                         <pic:blipFill>
-                          <a:blip r:embed="rId27" cstate="print">
+                          <a:blip r:embed="rId26" cstate="print">
                             <a:extLst>
                               <a:ext uri="{28A0092B-C50C-407E-A947-70E740481C1C}">
                                 <a14:useLocalDpi xmlns:a14="http://schemas.microsoft.com/office/drawing/2010/main" val="0"/>
@@ -12624,7 +11841,7 @@
                           <pic:cNvPicPr/>
                         </pic:nvPicPr>
                         <pic:blipFill>
-                          <a:blip r:embed="rId28"/>
+                          <a:blip r:embed="rId27"/>
                           <a:stretch>
                             <a:fillRect/>
                           </a:stretch>
@@ -12707,7 +11924,7 @@
                           <pic:cNvPicPr/>
                         </pic:nvPicPr>
                         <pic:blipFill>
-                          <a:blip r:embed="rId29"/>
+                          <a:blip r:embed="rId28"/>
                           <a:stretch>
                             <a:fillRect/>
                           </a:stretch>
@@ -12767,10 +11984,10 @@
                   <v:path o:extrusionok="f" gradientshapeok="t" o:connecttype="rect"/>
                   <o:lock v:ext="edit" aspectratio="t"/>
                 </v:shapetype>
-                <v:shape id="_x0000_i1025" type="#_x0000_t75" style="width:54pt;height:54pt" o:ole="">
-                  <v:imagedata r:id="rId30" o:title=""/>
+                <v:shape id="_x0000_i1025" type="#_x0000_t75" style="width:53.75pt;height:54.25pt" o:ole="">
+                  <v:imagedata r:id="rId29" o:title=""/>
                 </v:shape>
-                <o:OLEObject Type="Embed" ProgID="PBrush" ShapeID="_x0000_i1025" DrawAspect="Content" ObjectID="_1843805015" r:id="rId31"/>
+                <o:OLEObject Type="Embed" ProgID="PBrush" ShapeID="_x0000_i1025" DrawAspect="Content" ObjectID="_1843990212" r:id="rId30"/>
               </w:object>
             </w:r>
           </w:p>
@@ -12830,7 +12047,7 @@
                           <pic:cNvPicPr/>
                         </pic:nvPicPr>
                         <pic:blipFill>
-                          <a:blip r:embed="rId32"/>
+                          <a:blip r:embed="rId31"/>
                           <a:stretch>
                             <a:fillRect/>
                           </a:stretch>
@@ -12888,7 +12105,7 @@
                           <pic:cNvPicPr/>
                         </pic:nvPicPr>
                         <pic:blipFill>
-                          <a:blip r:embed="rId33"/>
+                          <a:blip r:embed="rId32"/>
                           <a:stretch>
                             <a:fillRect/>
                           </a:stretch>
@@ -12973,7 +12190,7 @@
                           </pic:cNvPicPr>
                         </pic:nvPicPr>
                         <pic:blipFill>
-                          <a:blip r:embed="rId34" cstate="print">
+                          <a:blip r:embed="rId33" cstate="print">
                             <a:extLst>
                               <a:ext uri="{28A0092B-C50C-407E-A947-70E740481C1C}">
                                 <a14:useLocalDpi xmlns:a14="http://schemas.microsoft.com/office/drawing/2010/main" val="0"/>
@@ -13024,10 +12241,10 @@
             </w:r>
             <w:r>
               <w:object w:dxaOrig="3696" w:dyaOrig="5040" w14:anchorId="24D8BBC0">
-                <v:shape id="_x0000_i1026" type="#_x0000_t75" style="width:42pt;height:54pt" o:ole="">
-                  <v:imagedata r:id="rId35" o:title=""/>
+                <v:shape id="_x0000_i1026" type="#_x0000_t75" style="width:41.9pt;height:53.75pt" o:ole="">
+                  <v:imagedata r:id="rId34" o:title=""/>
                 </v:shape>
-                <o:OLEObject Type="Embed" ProgID="PBrush" ShapeID="_x0000_i1026" DrawAspect="Content" ObjectID="_1843805016" r:id="rId36"/>
+                <o:OLEObject Type="Embed" ProgID="PBrush" ShapeID="_x0000_i1026" DrawAspect="Content" ObjectID="_1843990213" r:id="rId35"/>
               </w:object>
             </w:r>
           </w:p>
@@ -13095,7 +12312,7 @@
                           </pic:cNvPicPr>
                         </pic:nvPicPr>
                         <pic:blipFill>
-                          <a:blip r:embed="rId37" cstate="print">
+                          <a:blip r:embed="rId36" cstate="print">
                             <a:extLst>
                               <a:ext uri="{28A0092B-C50C-407E-A947-70E740481C1C}">
                                 <a14:useLocalDpi xmlns:a14="http://schemas.microsoft.com/office/drawing/2010/main" val="0"/>
@@ -13164,7 +12381,7 @@
                           <pic:cNvPicPr/>
                         </pic:nvPicPr>
                         <pic:blipFill>
-                          <a:blip r:embed="rId38"/>
+                          <a:blip r:embed="rId37"/>
                           <a:stretch>
                             <a:fillRect/>
                           </a:stretch>
@@ -13252,7 +12469,7 @@
                           </pic:cNvPicPr>
                         </pic:nvPicPr>
                         <pic:blipFill>
-                          <a:blip r:embed="rId39" cstate="print">
+                          <a:blip r:embed="rId38" cstate="print">
                             <a:extLst>
                               <a:ext uri="{28A0092B-C50C-407E-A947-70E740481C1C}">
                                 <a14:useLocalDpi xmlns:a14="http://schemas.microsoft.com/office/drawing/2010/main" val="0"/>
@@ -13286,7 +12503,7 @@
           </w:p>
         </w:tc>
       </w:tr>
-      <w:bookmarkEnd w:id="25"/>
+      <w:bookmarkEnd w:id="21"/>
     </w:tbl>
     <w:p>
       <w:pPr>
@@ -13337,7 +12554,7 @@
       </w:r>
     </w:p>
     <w:p>
-      <w:bookmarkStart w:id="29" w:name="_Hlk183955766"/>
+      <w:bookmarkStart w:id="25" w:name="_Hlk183955766"/>
       <w:r>
         <w:t xml:space="preserve">Once you have completed assembly of your POWER and 555 TIMER subsystems, </w:t>
       </w:r>
@@ -13351,7 +12568,7 @@
         <w:t>.</w:t>
       </w:r>
     </w:p>
-    <w:bookmarkEnd w:id="29"/>
+    <w:bookmarkEnd w:id="25"/>
     <w:p>
       <w:pPr>
         <w:pStyle w:val="ListParagraph"/>
@@ -13875,8 +13092,13 @@
       <w:r>
         <w:t xml:space="preserve"> simulation.  The TRI pin of the 555 Timer is available by </w:t>
       </w:r>
-      <w:r>
-        <w:t>remove the end of the oscilloscope probe and putting the tip into the yellow circled pad i</w:t>
+      <w:proofErr w:type="gramStart"/>
+      <w:r>
+        <w:t>remove</w:t>
+      </w:r>
+      <w:proofErr w:type="gramEnd"/>
+      <w:r>
+        <w:t xml:space="preserve"> the end of the oscilloscope probe and putting the tip into the yellow circled pad i</w:t>
       </w:r>
       <w:r>
         <w:t xml:space="preserve">n </w:t>
@@ -13897,7 +13119,7 @@
         <w:rPr>
           <w:noProof/>
         </w:rPr>
-        <w:t>10</w:t>
+        <w:t>9</w:t>
       </w:r>
       <w:r>
         <w:fldChar w:fldCharType="end"/>
@@ -13947,7 +13169,7 @@
                     </pic:cNvPicPr>
                   </pic:nvPicPr>
                   <pic:blipFill>
-                    <a:blip r:embed="rId40">
+                    <a:blip r:embed="rId39">
                       <a:extLst>
                         <a:ext uri="{28A0092B-C50C-407E-A947-70E740481C1C}">
                           <a14:useLocalDpi xmlns:a14="http://schemas.microsoft.com/office/drawing/2010/main" val="0"/>
@@ -14000,7 +13222,7 @@
                     </pic:cNvPicPr>
                   </pic:nvPicPr>
                   <pic:blipFill>
-                    <a:blip r:embed="rId41" cstate="print">
+                    <a:blip r:embed="rId40" cstate="print">
                       <a:extLst>
                         <a:ext uri="{28A0092B-C50C-407E-A947-70E740481C1C}">
                           <a14:useLocalDpi xmlns:a14="http://schemas.microsoft.com/office/drawing/2010/main" val="0"/>
@@ -14037,7 +13259,7 @@
         <w:pStyle w:val="Caption"/>
         <w:ind w:left="730"/>
       </w:pPr>
-      <w:bookmarkStart w:id="30" w:name="_Ref123110052"/>
+      <w:bookmarkStart w:id="26" w:name="_Ref123110052"/>
       <w:r>
         <w:t xml:space="preserve">Figure </w:t>
       </w:r>
@@ -14046,10 +13268,10 @@
           <w:rPr>
             <w:noProof/>
           </w:rPr>
-          <w:t>10</w:t>
+          <w:t>9</w:t>
         </w:r>
       </w:fldSimple>
-      <w:bookmarkEnd w:id="30"/>
+      <w:bookmarkEnd w:id="26"/>
       <w:r>
         <w:t xml:space="preserve">: </w:t>
       </w:r>
@@ -14065,7 +13287,7 @@
       <w:r>
         <w:t xml:space="preserve"> </w:t>
       </w:r>
-      <w:bookmarkStart w:id="31" w:name="_Hlk183955852"/>
+      <w:bookmarkStart w:id="27" w:name="_Hlk183955852"/>
       <w:r>
         <w:t>(Right) An</w:t>
       </w:r>
@@ -14094,7 +13316,7 @@
       <w:r>
         <w:t xml:space="preserve"> HMO724.</w:t>
       </w:r>
-      <w:bookmarkEnd w:id="31"/>
+      <w:bookmarkEnd w:id="27"/>
     </w:p>
     <w:p>
       <w:pPr>
@@ -14105,11 +13327,11 @@
         </w:numPr>
         <w:spacing w:line="240" w:lineRule="auto"/>
       </w:pPr>
-      <w:bookmarkStart w:id="32" w:name="assembly_screenShot"/>
+      <w:bookmarkStart w:id="28" w:name="assembly_screenShot"/>
       <w:r>
         <w:t xml:space="preserve">Take </w:t>
       </w:r>
-      <w:bookmarkEnd w:id="32"/>
+      <w:bookmarkEnd w:id="28"/>
       <w:r>
         <w:t>a s</w:t>
       </w:r>
@@ -14197,11 +13419,11 @@
       <w:pPr>
         <w:pStyle w:val="Heading1"/>
       </w:pPr>
-      <w:bookmarkStart w:id="33" w:name="_Hlk183955870"/>
+      <w:bookmarkStart w:id="29" w:name="_Hlk183955870"/>
       <w:r>
         <w:t>Comparison</w:t>
       </w:r>
-      <w:bookmarkEnd w:id="33"/>
+      <w:bookmarkEnd w:id="29"/>
       <w:r>
         <w:t>:</w:t>
       </w:r>
@@ -14217,7 +13439,7 @@
           <w:bCs/>
         </w:rPr>
       </w:pPr>
-      <w:bookmarkStart w:id="34" w:name="_Hlk93427808"/>
+      <w:bookmarkStart w:id="30" w:name="_Hlk93427808"/>
       <w:r>
         <w:rPr>
           <w:bCs/>
@@ -14296,15 +13518,15 @@
         </w:rPr>
         <w:t xml:space="preserve"> you </w:t>
       </w:r>
-      <w:bookmarkStart w:id="35" w:name="_Hlk183955913"/>
+      <w:bookmarkStart w:id="31" w:name="_Hlk183955913"/>
       <w:r>
         <w:rPr>
           <w:bCs/>
         </w:rPr>
         <w:t xml:space="preserve">found throughout this lab.  </w:t>
       </w:r>
-      <w:bookmarkEnd w:id="34"/>
-      <w:bookmarkEnd w:id="35"/>
+      <w:bookmarkEnd w:id="30"/>
+      <w:bookmarkEnd w:id="31"/>
       <w:r>
         <w:rPr>
           <w:bCs/>
@@ -14329,14 +13551,14 @@
         </w:rPr>
         <w:t xml:space="preserve"> column.  </w:t>
       </w:r>
-      <w:bookmarkStart w:id="36" w:name="_Hlk183955958"/>
+      <w:bookmarkStart w:id="32" w:name="_Hlk183955958"/>
       <w:r>
         <w:rPr>
           <w:bCs/>
         </w:rPr>
         <w:t>You will need this table in later labs, so keep it handy.</w:t>
       </w:r>
-      <w:bookmarkEnd w:id="36"/>
+      <w:bookmarkEnd w:id="32"/>
     </w:p>
     <w:p>
       <w:pPr>
@@ -14352,7 +13574,7 @@
         <w:pStyle w:val="Caption"/>
         <w:keepNext/>
       </w:pPr>
-      <w:bookmarkStart w:id="37" w:name="_Ref183891900"/>
+      <w:bookmarkStart w:id="33" w:name="_Ref183891900"/>
       <w:r>
         <w:t xml:space="preserve">Table </w:t>
       </w:r>
@@ -14364,7 +13586,7 @@
           <w:t>4</w:t>
         </w:r>
       </w:fldSimple>
-      <w:bookmarkEnd w:id="37"/>
+      <w:bookmarkEnd w:id="33"/>
       <w:r>
         <w:t>: Comparison of the timer output from analysis, simulation and the actual circuit.</w:t>
       </w:r>
@@ -15646,42 +14868,33 @@
       </w:r>
       <w:r>
         <w:rPr>
-          <w:b/>
+          <w:bCs/>
         </w:rPr>
         <w:tab/>
       </w:r>
-      <w:hyperlink w:anchor="simulation_Q1" w:history="1">
-        <w:r>
-          <w:rPr>
-            <w:rStyle w:val="Hyperlink"/>
-            <w:bCs/>
-          </w:rPr>
-          <w:t>Question 1</w:t>
-        </w:r>
-      </w:hyperlink>
       <w:r>
         <w:rPr>
           <w:bCs/>
         </w:rPr>
-        <w:tab/>
+        <w:t>S</w:t>
       </w:r>
       <w:r>
         <w:rPr>
           <w:bCs/>
         </w:rPr>
-        <w:t>S</w:t>
+        <w:t>imulation</w:t>
       </w:r>
       <w:r>
         <w:rPr>
           <w:bCs/>
         </w:rPr>
-        <w:t>imulation</w:t>
+        <w:t xml:space="preserve"> </w:t>
       </w:r>
       <w:r>
         <w:rPr>
           <w:bCs/>
         </w:rPr>
-        <w:t xml:space="preserve"> waveforms</w:t>
+        <w:t>schematic</w:t>
       </w:r>
     </w:p>
     <w:p>
@@ -15692,110 +14905,11 @@
           <w:bCs/>
         </w:rPr>
       </w:pPr>
-      <w:hyperlink w:anchor="simulation_Q2" w:history="1">
-        <w:r>
-          <w:rPr>
-            <w:rStyle w:val="Hyperlink"/>
-            <w:bCs/>
-          </w:rPr>
-          <w:t>Question 2</w:t>
-        </w:r>
-      </w:hyperlink>
       <w:r>
         <w:rPr>
           <w:bCs/>
         </w:rPr>
-        <w:tab/>
-      </w:r>
-      <w:r>
-        <w:rPr>
-          <w:bCs/>
-        </w:rPr>
-        <w:t>Show OUT and TRIG waveforms</w:t>
-      </w:r>
-    </w:p>
-    <w:p>
-      <w:pPr>
-        <w:spacing w:after="0" w:line="240" w:lineRule="auto"/>
-        <w:ind w:left="1434" w:firstLine="726"/>
-        <w:rPr>
-          <w:bCs/>
-        </w:rPr>
-      </w:pPr>
-      <w:hyperlink w:anchor="simulation_Q3" w:history="1">
-        <w:r>
-          <w:rPr>
-            <w:rStyle w:val="Hyperlink"/>
-            <w:bCs/>
-          </w:rPr>
-          <w:t>Question 3</w:t>
-        </w:r>
-      </w:hyperlink>
-      <w:r>
-        <w:rPr>
-          <w:bCs/>
-        </w:rPr>
-        <w:tab/>
-      </w:r>
-      <w:r>
-        <w:rPr>
-          <w:bCs/>
-        </w:rPr>
-        <w:t xml:space="preserve">Measure </w:t>
-      </w:r>
-      <w:r>
-        <w:rPr>
-          <w:bCs/>
-        </w:rPr>
-        <w:t>OUT waveform characteristics</w:t>
-      </w:r>
-    </w:p>
-    <w:p>
-      <w:pPr>
-        <w:spacing w:after="0" w:line="240" w:lineRule="auto"/>
-        <w:ind w:left="1434" w:firstLine="726"/>
-        <w:rPr>
-          <w:bCs/>
-        </w:rPr>
-      </w:pPr>
-      <w:hyperlink w:anchor="simulation_Q4" w:history="1">
-        <w:r>
-          <w:rPr>
-            <w:rStyle w:val="Hyperlink"/>
-            <w:bCs/>
-          </w:rPr>
-          <w:t>Question 4</w:t>
-        </w:r>
-      </w:hyperlink>
-      <w:r>
-        <w:rPr>
-          <w:bCs/>
-        </w:rPr>
-        <w:tab/>
-      </w:r>
-      <w:r>
-        <w:rPr>
-          <w:bCs/>
-        </w:rPr>
-        <w:t xml:space="preserve">Measure </w:t>
-      </w:r>
-      <w:r>
-        <w:rPr>
-          <w:bCs/>
-        </w:rPr>
-        <w:t>TRI</w:t>
-      </w:r>
-      <w:r>
-        <w:rPr>
-          <w:bCs/>
-        </w:rPr>
-        <w:t>G</w:t>
-      </w:r>
-      <w:r>
-        <w:rPr>
-          <w:bCs/>
-        </w:rPr>
-        <w:t xml:space="preserve"> waveform characteristics</w:t>
+        <w:t>Simulation waveforms</w:t>
       </w:r>
     </w:p>
     <w:p>
@@ -16075,12 +15189,12 @@
       </w:pPr>
     </w:p>
     <w:sectPr>
-      <w:headerReference w:type="even" r:id="rId42"/>
-      <w:headerReference w:type="default" r:id="rId43"/>
-      <w:footerReference w:type="even" r:id="rId44"/>
-      <w:footerReference w:type="default" r:id="rId45"/>
-      <w:headerReference w:type="first" r:id="rId46"/>
-      <w:footerReference w:type="first" r:id="rId47"/>
+      <w:headerReference w:type="even" r:id="rId41"/>
+      <w:headerReference w:type="default" r:id="rId42"/>
+      <w:footerReference w:type="even" r:id="rId43"/>
+      <w:footerReference w:type="default" r:id="rId44"/>
+      <w:headerReference w:type="first" r:id="rId45"/>
+      <w:footerReference w:type="first" r:id="rId46"/>
       <w:pgSz w:w="12240" w:h="15840"/>
       <w:pgMar w:top="1509" w:right="1436" w:bottom="1480" w:left="1440" w:header="720" w:footer="719" w:gutter="0"/>
       <w:cols w:space="720"/>

</xml_diff>